<commit_message>
httpSearchKeyValue with search value
</commit_message>
<xml_diff>
--- a/frontend/public/documentation/FunctionsUserManual.docx
+++ b/frontend/public/documentation/FunctionsUserManual.docx
@@ -459,7 +459,7 @@
             </w:rPr>
             <w:fldChar w:fldCharType="separate"/>
           </w:r>
-          <w:hyperlink w:anchor="_Toc225926349" w:history="1">
+          <w:hyperlink w:anchor="_Toc226112795" w:history="1">
             <w:r>
               <w:rPr>
                 <w:rStyle w:val="Hyperlink"/>
@@ -487,7 +487,7 @@
                 <w:noProof/>
                 <w:webHidden/>
               </w:rPr>
-              <w:instrText xml:space="preserve"> PAGEREF _Toc225926349 \h </w:instrText>
+              <w:instrText xml:space="preserve"> PAGEREF _Toc226112795 \h </w:instrText>
             </w:r>
             <w:r>
               <w:rPr>
@@ -536,7 +536,7 @@
               <w14:ligatures w14:val="standardContextual"/>
             </w:rPr>
           </w:pPr>
-          <w:hyperlink w:anchor="_Toc225926350" w:history="1">
+          <w:hyperlink w:anchor="_Toc226112796" w:history="1">
             <w:r>
               <w:rPr>
                 <w:rStyle w:val="Hyperlink"/>
@@ -564,7 +564,7 @@
                 <w:noProof/>
                 <w:webHidden/>
               </w:rPr>
-              <w:instrText xml:space="preserve"> PAGEREF _Toc225926350 \h </w:instrText>
+              <w:instrText xml:space="preserve"> PAGEREF _Toc226112796 \h </w:instrText>
             </w:r>
             <w:r>
               <w:rPr>
@@ -611,7 +611,7 @@
               <w14:ligatures w14:val="standardContextual"/>
             </w:rPr>
           </w:pPr>
-          <w:hyperlink w:anchor="_Toc225926351" w:history="1">
+          <w:hyperlink w:anchor="_Toc226112797" w:history="1">
             <w:r>
               <w:rPr>
                 <w:rStyle w:val="Hyperlink"/>
@@ -647,7 +647,7 @@
                 <w:noProof/>
                 <w:webHidden/>
               </w:rPr>
-              <w:instrText xml:space="preserve"> PAGEREF _Toc225926351 \h </w:instrText>
+              <w:instrText xml:space="preserve"> PAGEREF _Toc226112797 \h </w:instrText>
             </w:r>
             <w:r>
               <w:rPr>
@@ -694,7 +694,7 @@
               <w14:ligatures w14:val="standardContextual"/>
             </w:rPr>
           </w:pPr>
-          <w:hyperlink w:anchor="_Toc225926352" w:history="1">
+          <w:hyperlink w:anchor="_Toc226112798" w:history="1">
             <w:r>
               <w:rPr>
                 <w:rStyle w:val="Hyperlink"/>
@@ -738,7 +738,7 @@
                 <w:noProof/>
                 <w:webHidden/>
               </w:rPr>
-              <w:instrText xml:space="preserve"> PAGEREF _Toc225926352 \h </w:instrText>
+              <w:instrText xml:space="preserve"> PAGEREF _Toc226112798 \h </w:instrText>
             </w:r>
             <w:r>
               <w:rPr>
@@ -785,7 +785,7 @@
               <w14:ligatures w14:val="standardContextual"/>
             </w:rPr>
           </w:pPr>
-          <w:hyperlink w:anchor="_Toc225926353" w:history="1">
+          <w:hyperlink w:anchor="_Toc226112799" w:history="1">
             <w:r>
               <w:rPr>
                 <w:rStyle w:val="Hyperlink"/>
@@ -829,7 +829,7 @@
                 <w:noProof/>
                 <w:webHidden/>
               </w:rPr>
-              <w:instrText xml:space="preserve"> PAGEREF _Toc225926353 \h </w:instrText>
+              <w:instrText xml:space="preserve"> PAGEREF _Toc226112799 \h </w:instrText>
             </w:r>
             <w:r>
               <w:rPr>
@@ -876,7 +876,7 @@
               <w14:ligatures w14:val="standardContextual"/>
             </w:rPr>
           </w:pPr>
-          <w:hyperlink w:anchor="_Toc225926354" w:history="1">
+          <w:hyperlink w:anchor="_Toc226112800" w:history="1">
             <w:r>
               <w:rPr>
                 <w:rStyle w:val="Hyperlink"/>
@@ -911,7 +911,7 @@
                 <w:noProof/>
                 <w:webHidden/>
               </w:rPr>
-              <w:instrText xml:space="preserve"> PAGEREF _Toc225926354 \h </w:instrText>
+              <w:instrText xml:space="preserve"> PAGEREF _Toc226112800 \h </w:instrText>
             </w:r>
             <w:r>
               <w:rPr>
@@ -958,7 +958,7 @@
               <w14:ligatures w14:val="standardContextual"/>
             </w:rPr>
           </w:pPr>
-          <w:hyperlink w:anchor="_Toc225926355" w:history="1">
+          <w:hyperlink w:anchor="_Toc226112801" w:history="1">
             <w:r>
               <w:rPr>
                 <w:rStyle w:val="Hyperlink"/>
@@ -994,7 +994,7 @@
                 <w:noProof/>
                 <w:webHidden/>
               </w:rPr>
-              <w:instrText xml:space="preserve"> PAGEREF _Toc225926355 \h </w:instrText>
+              <w:instrText xml:space="preserve"> PAGEREF _Toc226112801 \h </w:instrText>
             </w:r>
             <w:r>
               <w:rPr>
@@ -1041,7 +1041,7 @@
               <w14:ligatures w14:val="standardContextual"/>
             </w:rPr>
           </w:pPr>
-          <w:hyperlink w:anchor="_Toc225926356" w:history="1">
+          <w:hyperlink w:anchor="_Toc226112802" w:history="1">
             <w:r>
               <w:rPr>
                 <w:rStyle w:val="Hyperlink"/>
@@ -1077,7 +1077,7 @@
                 <w:noProof/>
                 <w:webHidden/>
               </w:rPr>
-              <w:instrText xml:space="preserve"> PAGEREF _Toc225926356 \h </w:instrText>
+              <w:instrText xml:space="preserve"> PAGEREF _Toc226112802 \h </w:instrText>
             </w:r>
             <w:r>
               <w:rPr>
@@ -1124,7 +1124,7 @@
               <w14:ligatures w14:val="standardContextual"/>
             </w:rPr>
           </w:pPr>
-          <w:hyperlink w:anchor="_Toc225926357" w:history="1">
+          <w:hyperlink w:anchor="_Toc226112803" w:history="1">
             <w:r>
               <w:rPr>
                 <w:rStyle w:val="Hyperlink"/>
@@ -1160,7 +1160,7 @@
                 <w:noProof/>
                 <w:webHidden/>
               </w:rPr>
-              <w:instrText xml:space="preserve"> PAGEREF _Toc225926357 \h </w:instrText>
+              <w:instrText xml:space="preserve"> PAGEREF _Toc226112803 \h </w:instrText>
             </w:r>
             <w:r>
               <w:rPr>
@@ -1207,7 +1207,7 @@
               <w14:ligatures w14:val="standardContextual"/>
             </w:rPr>
           </w:pPr>
-          <w:hyperlink w:anchor="_Toc225926358" w:history="1">
+          <w:hyperlink w:anchor="_Toc226112804" w:history="1">
             <w:r>
               <w:rPr>
                 <w:rStyle w:val="Hyperlink"/>
@@ -1242,7 +1242,7 @@
                 <w:noProof/>
                 <w:webHidden/>
               </w:rPr>
-              <w:instrText xml:space="preserve"> PAGEREF _Toc225926358 \h </w:instrText>
+              <w:instrText xml:space="preserve"> PAGEREF _Toc226112804 \h </w:instrText>
             </w:r>
             <w:r>
               <w:rPr>
@@ -1289,7 +1289,7 @@
               <w14:ligatures w14:val="standardContextual"/>
             </w:rPr>
           </w:pPr>
-          <w:hyperlink w:anchor="_Toc225926359" w:history="1">
+          <w:hyperlink w:anchor="_Toc226112805" w:history="1">
             <w:r>
               <w:rPr>
                 <w:rStyle w:val="Hyperlink"/>
@@ -1324,7 +1324,7 @@
                 <w:noProof/>
                 <w:webHidden/>
               </w:rPr>
-              <w:instrText xml:space="preserve"> PAGEREF _Toc225926359 \h </w:instrText>
+              <w:instrText xml:space="preserve"> PAGEREF _Toc226112805 \h </w:instrText>
             </w:r>
             <w:r>
               <w:rPr>
@@ -1371,7 +1371,7 @@
               <w14:ligatures w14:val="standardContextual"/>
             </w:rPr>
           </w:pPr>
-          <w:hyperlink w:anchor="_Toc225926360" w:history="1">
+          <w:hyperlink w:anchor="_Toc226112806" w:history="1">
             <w:r>
               <w:rPr>
                 <w:rStyle w:val="Hyperlink"/>
@@ -1406,7 +1406,7 @@
                 <w:noProof/>
                 <w:webHidden/>
               </w:rPr>
-              <w:instrText xml:space="preserve"> PAGEREF _Toc225926360 \h </w:instrText>
+              <w:instrText xml:space="preserve"> PAGEREF _Toc226112806 \h </w:instrText>
             </w:r>
             <w:r>
               <w:rPr>
@@ -1453,7 +1453,7 @@
               <w14:ligatures w14:val="standardContextual"/>
             </w:rPr>
           </w:pPr>
-          <w:hyperlink w:anchor="_Toc225926361" w:history="1">
+          <w:hyperlink w:anchor="_Toc226112807" w:history="1">
             <w:r>
               <w:rPr>
                 <w:rStyle w:val="Hyperlink"/>
@@ -1488,7 +1488,7 @@
                 <w:noProof/>
                 <w:webHidden/>
               </w:rPr>
-              <w:instrText xml:space="preserve"> PAGEREF _Toc225926361 \h </w:instrText>
+              <w:instrText xml:space="preserve"> PAGEREF _Toc226112807 \h </w:instrText>
             </w:r>
             <w:r>
               <w:rPr>
@@ -1535,7 +1535,7 @@
               <w14:ligatures w14:val="standardContextual"/>
             </w:rPr>
           </w:pPr>
-          <w:hyperlink w:anchor="_Toc225926362" w:history="1">
+          <w:hyperlink w:anchor="_Toc226112808" w:history="1">
             <w:r>
               <w:rPr>
                 <w:rStyle w:val="Hyperlink"/>
@@ -1570,7 +1570,7 @@
                 <w:noProof/>
                 <w:webHidden/>
               </w:rPr>
-              <w:instrText xml:space="preserve"> PAGEREF _Toc225926362 \h </w:instrText>
+              <w:instrText xml:space="preserve"> PAGEREF _Toc226112808 \h </w:instrText>
             </w:r>
             <w:r>
               <w:rPr>
@@ -1617,7 +1617,7 @@
               <w14:ligatures w14:val="standardContextual"/>
             </w:rPr>
           </w:pPr>
-          <w:hyperlink w:anchor="_Toc225926363" w:history="1">
+          <w:hyperlink w:anchor="_Toc226112809" w:history="1">
             <w:r>
               <w:rPr>
                 <w:rStyle w:val="Hyperlink"/>
@@ -1652,7 +1652,7 @@
                 <w:noProof/>
                 <w:webHidden/>
               </w:rPr>
-              <w:instrText xml:space="preserve"> PAGEREF _Toc225926363 \h </w:instrText>
+              <w:instrText xml:space="preserve"> PAGEREF _Toc226112809 \h </w:instrText>
             </w:r>
             <w:r>
               <w:rPr>
@@ -1701,7 +1701,7 @@
               <w14:ligatures w14:val="standardContextual"/>
             </w:rPr>
           </w:pPr>
-          <w:hyperlink w:anchor="_Toc225926364" w:history="1">
+          <w:hyperlink w:anchor="_Toc226112810" w:history="1">
             <w:r>
               <w:rPr>
                 <w:rStyle w:val="Hyperlink"/>
@@ -1729,7 +1729,7 @@
                 <w:noProof/>
                 <w:webHidden/>
               </w:rPr>
-              <w:instrText xml:space="preserve"> PAGEREF _Toc225926364 \h </w:instrText>
+              <w:instrText xml:space="preserve"> PAGEREF _Toc226112810 \h </w:instrText>
             </w:r>
             <w:r>
               <w:rPr>
@@ -1776,7 +1776,7 @@
               <w14:ligatures w14:val="standardContextual"/>
             </w:rPr>
           </w:pPr>
-          <w:hyperlink w:anchor="_Toc225926365" w:history="1">
+          <w:hyperlink w:anchor="_Toc226112811" w:history="1">
             <w:r>
               <w:rPr>
                 <w:rStyle w:val="Hyperlink"/>
@@ -1812,7 +1812,7 @@
                 <w:noProof/>
                 <w:webHidden/>
               </w:rPr>
-              <w:instrText xml:space="preserve"> PAGEREF _Toc225926365 \h </w:instrText>
+              <w:instrText xml:space="preserve"> PAGEREF _Toc226112811 \h </w:instrText>
             </w:r>
             <w:r>
               <w:rPr>
@@ -1859,7 +1859,7 @@
               <w14:ligatures w14:val="standardContextual"/>
             </w:rPr>
           </w:pPr>
-          <w:hyperlink w:anchor="_Toc225926366" w:history="1">
+          <w:hyperlink w:anchor="_Toc226112812" w:history="1">
             <w:r>
               <w:rPr>
                 <w:rStyle w:val="Hyperlink"/>
@@ -1895,7 +1895,7 @@
                 <w:noProof/>
                 <w:webHidden/>
               </w:rPr>
-              <w:instrText xml:space="preserve"> PAGEREF _Toc225926366 \h </w:instrText>
+              <w:instrText xml:space="preserve"> PAGEREF _Toc226112812 \h </w:instrText>
             </w:r>
             <w:r>
               <w:rPr>
@@ -1942,7 +1942,7 @@
               <w14:ligatures w14:val="standardContextual"/>
             </w:rPr>
           </w:pPr>
-          <w:hyperlink w:anchor="_Toc225926367" w:history="1">
+          <w:hyperlink w:anchor="_Toc226112813" w:history="1">
             <w:r>
               <w:rPr>
                 <w:rStyle w:val="Hyperlink"/>
@@ -1978,7 +1978,7 @@
                 <w:noProof/>
                 <w:webHidden/>
               </w:rPr>
-              <w:instrText xml:space="preserve"> PAGEREF _Toc225926367 \h </w:instrText>
+              <w:instrText xml:space="preserve"> PAGEREF _Toc226112813 \h </w:instrText>
             </w:r>
             <w:r>
               <w:rPr>
@@ -2025,7 +2025,7 @@
               <w14:ligatures w14:val="standardContextual"/>
             </w:rPr>
           </w:pPr>
-          <w:hyperlink w:anchor="_Toc225926368" w:history="1">
+          <w:hyperlink w:anchor="_Toc226112814" w:history="1">
             <w:r>
               <w:rPr>
                 <w:rStyle w:val="Hyperlink"/>
@@ -2061,7 +2061,7 @@
                 <w:noProof/>
                 <w:webHidden/>
               </w:rPr>
-              <w:instrText xml:space="preserve"> PAGEREF _Toc225926368 \h </w:instrText>
+              <w:instrText xml:space="preserve"> PAGEREF _Toc226112814 \h </w:instrText>
             </w:r>
             <w:r>
               <w:rPr>
@@ -2108,7 +2108,7 @@
               <w14:ligatures w14:val="standardContextual"/>
             </w:rPr>
           </w:pPr>
-          <w:hyperlink w:anchor="_Toc225926369" w:history="1">
+          <w:hyperlink w:anchor="_Toc226112815" w:history="1">
             <w:r>
               <w:rPr>
                 <w:rStyle w:val="Hyperlink"/>
@@ -2144,7 +2144,7 @@
                 <w:noProof/>
                 <w:webHidden/>
               </w:rPr>
-              <w:instrText xml:space="preserve"> PAGEREF _Toc225926369 \h </w:instrText>
+              <w:instrText xml:space="preserve"> PAGEREF _Toc226112815 \h </w:instrText>
             </w:r>
             <w:r>
               <w:rPr>
@@ -2191,7 +2191,7 @@
               <w14:ligatures w14:val="standardContextual"/>
             </w:rPr>
           </w:pPr>
-          <w:hyperlink w:anchor="_Toc225926370" w:history="1">
+          <w:hyperlink w:anchor="_Toc226112816" w:history="1">
             <w:r>
               <w:rPr>
                 <w:rStyle w:val="Hyperlink"/>
@@ -2235,7 +2235,7 @@
                 <w:noProof/>
                 <w:webHidden/>
               </w:rPr>
-              <w:instrText xml:space="preserve"> PAGEREF _Toc225926370 \h </w:instrText>
+              <w:instrText xml:space="preserve"> PAGEREF _Toc226112816 \h </w:instrText>
             </w:r>
             <w:r>
               <w:rPr>
@@ -2282,7 +2282,7 @@
               <w14:ligatures w14:val="standardContextual"/>
             </w:rPr>
           </w:pPr>
-          <w:hyperlink w:anchor="_Toc225926371" w:history="1">
+          <w:hyperlink w:anchor="_Toc226112817" w:history="1">
             <w:r>
               <w:rPr>
                 <w:rStyle w:val="Hyperlink"/>
@@ -2318,7 +2318,7 @@
                 <w:noProof/>
                 <w:webHidden/>
               </w:rPr>
-              <w:instrText xml:space="preserve"> PAGEREF _Toc225926371 \h </w:instrText>
+              <w:instrText xml:space="preserve"> PAGEREF _Toc226112817 \h </w:instrText>
             </w:r>
             <w:r>
               <w:rPr>
@@ -2365,7 +2365,7 @@
               <w14:ligatures w14:val="standardContextual"/>
             </w:rPr>
           </w:pPr>
-          <w:hyperlink w:anchor="_Toc225926372" w:history="1">
+          <w:hyperlink w:anchor="_Toc226112818" w:history="1">
             <w:r>
               <w:rPr>
                 <w:rStyle w:val="Hyperlink"/>
@@ -2401,7 +2401,7 @@
                 <w:noProof/>
                 <w:webHidden/>
               </w:rPr>
-              <w:instrText xml:space="preserve"> PAGEREF _Toc225926372 \h </w:instrText>
+              <w:instrText xml:space="preserve"> PAGEREF _Toc226112818 \h </w:instrText>
             </w:r>
             <w:r>
               <w:rPr>
@@ -2448,7 +2448,7 @@
               <w14:ligatures w14:val="standardContextual"/>
             </w:rPr>
           </w:pPr>
-          <w:hyperlink w:anchor="_Toc225926373" w:history="1">
+          <w:hyperlink w:anchor="_Toc226112819" w:history="1">
             <w:r>
               <w:rPr>
                 <w:rStyle w:val="Hyperlink"/>
@@ -2484,7 +2484,7 @@
                 <w:noProof/>
                 <w:webHidden/>
               </w:rPr>
-              <w:instrText xml:space="preserve"> PAGEREF _Toc225926373 \h </w:instrText>
+              <w:instrText xml:space="preserve"> PAGEREF _Toc226112819 \h </w:instrText>
             </w:r>
             <w:r>
               <w:rPr>
@@ -2531,7 +2531,7 @@
               <w14:ligatures w14:val="standardContextual"/>
             </w:rPr>
           </w:pPr>
-          <w:hyperlink w:anchor="_Toc225926374" w:history="1">
+          <w:hyperlink w:anchor="_Toc226112820" w:history="1">
             <w:r>
               <w:rPr>
                 <w:rStyle w:val="Hyperlink"/>
@@ -2567,7 +2567,7 @@
                 <w:noProof/>
                 <w:webHidden/>
               </w:rPr>
-              <w:instrText xml:space="preserve"> PAGEREF _Toc225926374 \h </w:instrText>
+              <w:instrText xml:space="preserve"> PAGEREF _Toc226112820 \h </w:instrText>
             </w:r>
             <w:r>
               <w:rPr>
@@ -2614,7 +2614,7 @@
               <w14:ligatures w14:val="standardContextual"/>
             </w:rPr>
           </w:pPr>
-          <w:hyperlink w:anchor="_Toc225926375" w:history="1">
+          <w:hyperlink w:anchor="_Toc226112821" w:history="1">
             <w:r>
               <w:rPr>
                 <w:rStyle w:val="Hyperlink"/>
@@ -2650,7 +2650,7 @@
                 <w:noProof/>
                 <w:webHidden/>
               </w:rPr>
-              <w:instrText xml:space="preserve"> PAGEREF _Toc225926375 \h </w:instrText>
+              <w:instrText xml:space="preserve"> PAGEREF _Toc226112821 \h </w:instrText>
             </w:r>
             <w:r>
               <w:rPr>
@@ -2697,7 +2697,7 @@
               <w14:ligatures w14:val="standardContextual"/>
             </w:rPr>
           </w:pPr>
-          <w:hyperlink w:anchor="_Toc225926376" w:history="1">
+          <w:hyperlink w:anchor="_Toc226112822" w:history="1">
             <w:r>
               <w:rPr>
                 <w:rStyle w:val="Hyperlink"/>
@@ -2733,7 +2733,7 @@
                 <w:noProof/>
                 <w:webHidden/>
               </w:rPr>
-              <w:instrText xml:space="preserve"> PAGEREF _Toc225926376 \h </w:instrText>
+              <w:instrText xml:space="preserve"> PAGEREF _Toc226112822 \h </w:instrText>
             </w:r>
             <w:r>
               <w:rPr>
@@ -2780,7 +2780,7 @@
               <w14:ligatures w14:val="standardContextual"/>
             </w:rPr>
           </w:pPr>
-          <w:hyperlink w:anchor="_Toc225926377" w:history="1">
+          <w:hyperlink w:anchor="_Toc226112823" w:history="1">
             <w:r>
               <w:rPr>
                 <w:rStyle w:val="Hyperlink"/>
@@ -2816,7 +2816,7 @@
                 <w:noProof/>
                 <w:webHidden/>
               </w:rPr>
-              <w:instrText xml:space="preserve"> PAGEREF _Toc225926377 \h </w:instrText>
+              <w:instrText xml:space="preserve"> PAGEREF _Toc226112823 \h </w:instrText>
             </w:r>
             <w:r>
               <w:rPr>
@@ -2863,7 +2863,7 @@
               <w14:ligatures w14:val="standardContextual"/>
             </w:rPr>
           </w:pPr>
-          <w:hyperlink w:anchor="_Toc225926378" w:history="1">
+          <w:hyperlink w:anchor="_Toc226112824" w:history="1">
             <w:r>
               <w:rPr>
                 <w:rStyle w:val="Hyperlink"/>
@@ -2899,7 +2899,7 @@
                 <w:noProof/>
                 <w:webHidden/>
               </w:rPr>
-              <w:instrText xml:space="preserve"> PAGEREF _Toc225926378 \h </w:instrText>
+              <w:instrText xml:space="preserve"> PAGEREF _Toc226112824 \h </w:instrText>
             </w:r>
             <w:r>
               <w:rPr>
@@ -2946,7 +2946,7 @@
               <w14:ligatures w14:val="standardContextual"/>
             </w:rPr>
           </w:pPr>
-          <w:hyperlink w:anchor="_Toc225926379" w:history="1">
+          <w:hyperlink w:anchor="_Toc226112825" w:history="1">
             <w:r>
               <w:rPr>
                 <w:rStyle w:val="Hyperlink"/>
@@ -2982,7 +2982,7 @@
                 <w:noProof/>
                 <w:webHidden/>
               </w:rPr>
-              <w:instrText xml:space="preserve"> PAGEREF _Toc225926379 \h </w:instrText>
+              <w:instrText xml:space="preserve"> PAGEREF _Toc226112825 \h </w:instrText>
             </w:r>
             <w:r>
               <w:rPr>
@@ -3029,7 +3029,7 @@
               <w14:ligatures w14:val="standardContextual"/>
             </w:rPr>
           </w:pPr>
-          <w:hyperlink w:anchor="_Toc225926380" w:history="1">
+          <w:hyperlink w:anchor="_Toc226112826" w:history="1">
             <w:r>
               <w:rPr>
                 <w:rStyle w:val="Hyperlink"/>
@@ -3065,7 +3065,7 @@
                 <w:noProof/>
                 <w:webHidden/>
               </w:rPr>
-              <w:instrText xml:space="preserve"> PAGEREF _Toc225926380 \h </w:instrText>
+              <w:instrText xml:space="preserve"> PAGEREF _Toc226112826 \h </w:instrText>
             </w:r>
             <w:r>
               <w:rPr>
@@ -3112,7 +3112,7 @@
               <w14:ligatures w14:val="standardContextual"/>
             </w:rPr>
           </w:pPr>
-          <w:hyperlink w:anchor="_Toc225926381" w:history="1">
+          <w:hyperlink w:anchor="_Toc226112827" w:history="1">
             <w:r>
               <w:rPr>
                 <w:rStyle w:val="Hyperlink"/>
@@ -3148,7 +3148,7 @@
                 <w:noProof/>
                 <w:webHidden/>
               </w:rPr>
-              <w:instrText xml:space="preserve"> PAGEREF _Toc225926381 \h </w:instrText>
+              <w:instrText xml:space="preserve"> PAGEREF _Toc226112827 \h </w:instrText>
             </w:r>
             <w:r>
               <w:rPr>
@@ -3195,7 +3195,7 @@
               <w14:ligatures w14:val="standardContextual"/>
             </w:rPr>
           </w:pPr>
-          <w:hyperlink w:anchor="_Toc225926382" w:history="1">
+          <w:hyperlink w:anchor="_Toc226112828" w:history="1">
             <w:r>
               <w:rPr>
                 <w:rStyle w:val="Hyperlink"/>
@@ -3231,7 +3231,7 @@
                 <w:noProof/>
                 <w:webHidden/>
               </w:rPr>
-              <w:instrText xml:space="preserve"> PAGEREF _Toc225926382 \h </w:instrText>
+              <w:instrText xml:space="preserve"> PAGEREF _Toc226112828 \h </w:instrText>
             </w:r>
             <w:r>
               <w:rPr>
@@ -3278,7 +3278,7 @@
               <w14:ligatures w14:val="standardContextual"/>
             </w:rPr>
           </w:pPr>
-          <w:hyperlink w:anchor="_Toc225926383" w:history="1">
+          <w:hyperlink w:anchor="_Toc226112829" w:history="1">
             <w:r>
               <w:rPr>
                 <w:rStyle w:val="Hyperlink"/>
@@ -3314,7 +3314,7 @@
                 <w:noProof/>
                 <w:webHidden/>
               </w:rPr>
-              <w:instrText xml:space="preserve"> PAGEREF _Toc225926383 \h </w:instrText>
+              <w:instrText xml:space="preserve"> PAGEREF _Toc226112829 \h </w:instrText>
             </w:r>
             <w:r>
               <w:rPr>
@@ -3361,7 +3361,7 @@
               <w14:ligatures w14:val="standardContextual"/>
             </w:rPr>
           </w:pPr>
-          <w:hyperlink w:anchor="_Toc225926384" w:history="1">
+          <w:hyperlink w:anchor="_Toc226112830" w:history="1">
             <w:r>
               <w:rPr>
                 <w:rStyle w:val="Hyperlink"/>
@@ -3397,7 +3397,7 @@
                 <w:noProof/>
                 <w:webHidden/>
               </w:rPr>
-              <w:instrText xml:space="preserve"> PAGEREF _Toc225926384 \h </w:instrText>
+              <w:instrText xml:space="preserve"> PAGEREF _Toc226112830 \h </w:instrText>
             </w:r>
             <w:r>
               <w:rPr>
@@ -3444,7 +3444,7 @@
               <w14:ligatures w14:val="standardContextual"/>
             </w:rPr>
           </w:pPr>
-          <w:hyperlink w:anchor="_Toc225926385" w:history="1">
+          <w:hyperlink w:anchor="_Toc226112831" w:history="1">
             <w:r>
               <w:rPr>
                 <w:rStyle w:val="Hyperlink"/>
@@ -3481,7 +3481,7 @@
                 <w:noProof/>
                 <w:webHidden/>
               </w:rPr>
-              <w:instrText xml:space="preserve"> PAGEREF _Toc225926385 \h </w:instrText>
+              <w:instrText xml:space="preserve"> PAGEREF _Toc226112831 \h </w:instrText>
             </w:r>
             <w:r>
               <w:rPr>
@@ -3528,7 +3528,7 @@
               <w14:ligatures w14:val="standardContextual"/>
             </w:rPr>
           </w:pPr>
-          <w:hyperlink w:anchor="_Toc225926386" w:history="1">
+          <w:hyperlink w:anchor="_Toc226112832" w:history="1">
             <w:r>
               <w:rPr>
                 <w:rStyle w:val="Hyperlink"/>
@@ -3564,7 +3564,7 @@
                 <w:noProof/>
                 <w:webHidden/>
               </w:rPr>
-              <w:instrText xml:space="preserve"> PAGEREF _Toc225926386 \h </w:instrText>
+              <w:instrText xml:space="preserve"> PAGEREF _Toc226112832 \h </w:instrText>
             </w:r>
             <w:r>
               <w:rPr>
@@ -3611,7 +3611,7 @@
               <w14:ligatures w14:val="standardContextual"/>
             </w:rPr>
           </w:pPr>
-          <w:hyperlink w:anchor="_Toc225926387" w:history="1">
+          <w:hyperlink w:anchor="_Toc226112833" w:history="1">
             <w:r>
               <w:rPr>
                 <w:rStyle w:val="Hyperlink"/>
@@ -3647,7 +3647,7 @@
                 <w:noProof/>
                 <w:webHidden/>
               </w:rPr>
-              <w:instrText xml:space="preserve"> PAGEREF _Toc225926387 \h </w:instrText>
+              <w:instrText xml:space="preserve"> PAGEREF _Toc226112833 \h </w:instrText>
             </w:r>
             <w:r>
               <w:rPr>
@@ -3694,7 +3694,7 @@
               <w14:ligatures w14:val="standardContextual"/>
             </w:rPr>
           </w:pPr>
-          <w:hyperlink w:anchor="_Toc225926388" w:history="1">
+          <w:hyperlink w:anchor="_Toc226112834" w:history="1">
             <w:r>
               <w:rPr>
                 <w:rStyle w:val="Hyperlink"/>
@@ -3730,7 +3730,7 @@
                 <w:noProof/>
                 <w:webHidden/>
               </w:rPr>
-              <w:instrText xml:space="preserve"> PAGEREF _Toc225926388 \h </w:instrText>
+              <w:instrText xml:space="preserve"> PAGEREF _Toc226112834 \h </w:instrText>
             </w:r>
             <w:r>
               <w:rPr>
@@ -3777,7 +3777,7 @@
               <w14:ligatures w14:val="standardContextual"/>
             </w:rPr>
           </w:pPr>
-          <w:hyperlink w:anchor="_Toc225926389" w:history="1">
+          <w:hyperlink w:anchor="_Toc226112835" w:history="1">
             <w:r>
               <w:rPr>
                 <w:rStyle w:val="Hyperlink"/>
@@ -3821,7 +3821,7 @@
                 <w:noProof/>
                 <w:webHidden/>
               </w:rPr>
-              <w:instrText xml:space="preserve"> PAGEREF _Toc225926389 \h </w:instrText>
+              <w:instrText xml:space="preserve"> PAGEREF _Toc226112835 \h </w:instrText>
             </w:r>
             <w:r>
               <w:rPr>
@@ -3868,7 +3868,7 @@
               <w14:ligatures w14:val="standardContextual"/>
             </w:rPr>
           </w:pPr>
-          <w:hyperlink w:anchor="_Toc225926390" w:history="1">
+          <w:hyperlink w:anchor="_Toc226112836" w:history="1">
             <w:r>
               <w:rPr>
                 <w:rStyle w:val="Hyperlink"/>
@@ -3903,7 +3903,7 @@
                 <w:noProof/>
                 <w:webHidden/>
               </w:rPr>
-              <w:instrText xml:space="preserve"> PAGEREF _Toc225926390 \h </w:instrText>
+              <w:instrText xml:space="preserve"> PAGEREF _Toc226112836 \h </w:instrText>
             </w:r>
             <w:r>
               <w:rPr>
@@ -3950,7 +3950,7 @@
               <w14:ligatures w14:val="standardContextual"/>
             </w:rPr>
           </w:pPr>
-          <w:hyperlink w:anchor="_Toc225926391" w:history="1">
+          <w:hyperlink w:anchor="_Toc226112837" w:history="1">
             <w:r>
               <w:rPr>
                 <w:rStyle w:val="Hyperlink"/>
@@ -3985,7 +3985,7 @@
                 <w:noProof/>
                 <w:webHidden/>
               </w:rPr>
-              <w:instrText xml:space="preserve"> PAGEREF _Toc225926391 \h </w:instrText>
+              <w:instrText xml:space="preserve"> PAGEREF _Toc226112837 \h </w:instrText>
             </w:r>
             <w:r>
               <w:rPr>
@@ -4032,7 +4032,7 @@
               <w14:ligatures w14:val="standardContextual"/>
             </w:rPr>
           </w:pPr>
-          <w:hyperlink w:anchor="_Toc225926392" w:history="1">
+          <w:hyperlink w:anchor="_Toc226112838" w:history="1">
             <w:r>
               <w:rPr>
                 <w:rStyle w:val="Hyperlink"/>
@@ -4067,7 +4067,7 @@
                 <w:noProof/>
                 <w:webHidden/>
               </w:rPr>
-              <w:instrText xml:space="preserve"> PAGEREF _Toc225926392 \h </w:instrText>
+              <w:instrText xml:space="preserve"> PAGEREF _Toc226112838 \h </w:instrText>
             </w:r>
             <w:r>
               <w:rPr>
@@ -4114,7 +4114,7 @@
               <w14:ligatures w14:val="standardContextual"/>
             </w:rPr>
           </w:pPr>
-          <w:hyperlink w:anchor="_Toc225926393" w:history="1">
+          <w:hyperlink w:anchor="_Toc226112839" w:history="1">
             <w:r>
               <w:rPr>
                 <w:rStyle w:val="Hyperlink"/>
@@ -4149,7 +4149,7 @@
                 <w:noProof/>
                 <w:webHidden/>
               </w:rPr>
-              <w:instrText xml:space="preserve"> PAGEREF _Toc225926393 \h </w:instrText>
+              <w:instrText xml:space="preserve"> PAGEREF _Toc226112839 \h </w:instrText>
             </w:r>
             <w:r>
               <w:rPr>
@@ -4198,7 +4198,7 @@
               <w14:ligatures w14:val="standardContextual"/>
             </w:rPr>
           </w:pPr>
-          <w:hyperlink w:anchor="_Toc225926394" w:history="1">
+          <w:hyperlink w:anchor="_Toc226112840" w:history="1">
             <w:r>
               <w:rPr>
                 <w:rStyle w:val="Hyperlink"/>
@@ -4226,7 +4226,7 @@
                 <w:noProof/>
                 <w:webHidden/>
               </w:rPr>
-              <w:instrText xml:space="preserve"> PAGEREF _Toc225926394 \h </w:instrText>
+              <w:instrText xml:space="preserve"> PAGEREF _Toc226112840 \h </w:instrText>
             </w:r>
             <w:r>
               <w:rPr>
@@ -4273,7 +4273,7 @@
               <w14:ligatures w14:val="standardContextual"/>
             </w:rPr>
           </w:pPr>
-          <w:hyperlink w:anchor="_Toc225926395" w:history="1">
+          <w:hyperlink w:anchor="_Toc226112841" w:history="1">
             <w:r>
               <w:rPr>
                 <w:rStyle w:val="Hyperlink"/>
@@ -4309,7 +4309,7 @@
                 <w:noProof/>
                 <w:webHidden/>
               </w:rPr>
-              <w:instrText xml:space="preserve"> PAGEREF _Toc225926395 \h </w:instrText>
+              <w:instrText xml:space="preserve"> PAGEREF _Toc226112841 \h </w:instrText>
             </w:r>
             <w:r>
               <w:rPr>
@@ -4356,7 +4356,7 @@
               <w14:ligatures w14:val="standardContextual"/>
             </w:rPr>
           </w:pPr>
-          <w:hyperlink w:anchor="_Toc225926396" w:history="1">
+          <w:hyperlink w:anchor="_Toc226112842" w:history="1">
             <w:r>
               <w:rPr>
                 <w:rStyle w:val="Hyperlink"/>
@@ -4400,7 +4400,7 @@
                 <w:noProof/>
                 <w:webHidden/>
               </w:rPr>
-              <w:instrText xml:space="preserve"> PAGEREF _Toc225926396 \h </w:instrText>
+              <w:instrText xml:space="preserve"> PAGEREF _Toc226112842 \h </w:instrText>
             </w:r>
             <w:r>
               <w:rPr>
@@ -4447,7 +4447,7 @@
               <w14:ligatures w14:val="standardContextual"/>
             </w:rPr>
           </w:pPr>
-          <w:hyperlink w:anchor="_Toc225926397" w:history="1">
+          <w:hyperlink w:anchor="_Toc226112843" w:history="1">
             <w:r>
               <w:rPr>
                 <w:rStyle w:val="Hyperlink"/>
@@ -4482,7 +4482,7 @@
                 <w:noProof/>
                 <w:webHidden/>
               </w:rPr>
-              <w:instrText xml:space="preserve"> PAGEREF _Toc225926397 \h </w:instrText>
+              <w:instrText xml:space="preserve"> PAGEREF _Toc226112843 \h </w:instrText>
             </w:r>
             <w:r>
               <w:rPr>
@@ -4529,7 +4529,7 @@
               <w14:ligatures w14:val="standardContextual"/>
             </w:rPr>
           </w:pPr>
-          <w:hyperlink w:anchor="_Toc225926398" w:history="1">
+          <w:hyperlink w:anchor="_Toc226112844" w:history="1">
             <w:r>
               <w:rPr>
                 <w:rStyle w:val="Hyperlink"/>
@@ -4564,7 +4564,7 @@
                 <w:noProof/>
                 <w:webHidden/>
               </w:rPr>
-              <w:instrText xml:space="preserve"> PAGEREF _Toc225926398 \h </w:instrText>
+              <w:instrText xml:space="preserve"> PAGEREF _Toc226112844 \h </w:instrText>
             </w:r>
             <w:r>
               <w:rPr>
@@ -4611,7 +4611,7 @@
               <w14:ligatures w14:val="standardContextual"/>
             </w:rPr>
           </w:pPr>
-          <w:hyperlink w:anchor="_Toc225926399" w:history="1">
+          <w:hyperlink w:anchor="_Toc226112845" w:history="1">
             <w:r>
               <w:rPr>
                 <w:rStyle w:val="Hyperlink"/>
@@ -4646,7 +4646,7 @@
                 <w:noProof/>
                 <w:webHidden/>
               </w:rPr>
-              <w:instrText xml:space="preserve"> PAGEREF _Toc225926399 \h </w:instrText>
+              <w:instrText xml:space="preserve"> PAGEREF _Toc226112845 \h </w:instrText>
             </w:r>
             <w:r>
               <w:rPr>
@@ -4695,7 +4695,7 @@
               <w14:ligatures w14:val="standardContextual"/>
             </w:rPr>
           </w:pPr>
-          <w:hyperlink w:anchor="_Toc225926400" w:history="1">
+          <w:hyperlink w:anchor="_Toc226112846" w:history="1">
             <w:r>
               <w:rPr>
                 <w:rStyle w:val="Hyperlink"/>
@@ -4723,7 +4723,7 @@
                 <w:noProof/>
                 <w:webHidden/>
               </w:rPr>
-              <w:instrText xml:space="preserve"> PAGEREF _Toc225926400 \h </w:instrText>
+              <w:instrText xml:space="preserve"> PAGEREF _Toc226112846 \h </w:instrText>
             </w:r>
             <w:r>
               <w:rPr>
@@ -4770,7 +4770,7 @@
               <w14:ligatures w14:val="standardContextual"/>
             </w:rPr>
           </w:pPr>
-          <w:hyperlink w:anchor="_Toc225926401" w:history="1">
+          <w:hyperlink w:anchor="_Toc226112847" w:history="1">
             <w:r>
               <w:rPr>
                 <w:rStyle w:val="Hyperlink"/>
@@ -4806,7 +4806,7 @@
                 <w:noProof/>
                 <w:webHidden/>
               </w:rPr>
-              <w:instrText xml:space="preserve"> PAGEREF _Toc225926401 \h </w:instrText>
+              <w:instrText xml:space="preserve"> PAGEREF _Toc226112847 \h </w:instrText>
             </w:r>
             <w:r>
               <w:rPr>
@@ -4853,7 +4853,7 @@
               <w14:ligatures w14:val="standardContextual"/>
             </w:rPr>
           </w:pPr>
-          <w:hyperlink w:anchor="_Toc225926402" w:history="1">
+          <w:hyperlink w:anchor="_Toc226112848" w:history="1">
             <w:r>
               <w:rPr>
                 <w:rStyle w:val="Hyperlink"/>
@@ -4889,7 +4889,7 @@
                 <w:noProof/>
                 <w:webHidden/>
               </w:rPr>
-              <w:instrText xml:space="preserve"> PAGEREF _Toc225926402 \h </w:instrText>
+              <w:instrText xml:space="preserve"> PAGEREF _Toc226112848 \h </w:instrText>
             </w:r>
             <w:r>
               <w:rPr>
@@ -4936,7 +4936,7 @@
               <w14:ligatures w14:val="standardContextual"/>
             </w:rPr>
           </w:pPr>
-          <w:hyperlink w:anchor="_Toc225926403" w:history="1">
+          <w:hyperlink w:anchor="_Toc226112849" w:history="1">
             <w:r>
               <w:rPr>
                 <w:rStyle w:val="Hyperlink"/>
@@ -4972,7 +4972,7 @@
                 <w:noProof/>
                 <w:webHidden/>
               </w:rPr>
-              <w:instrText xml:space="preserve"> PAGEREF _Toc225926403 \h </w:instrText>
+              <w:instrText xml:space="preserve"> PAGEREF _Toc226112849 \h </w:instrText>
             </w:r>
             <w:r>
               <w:rPr>
@@ -5019,7 +5019,7 @@
               <w14:ligatures w14:val="standardContextual"/>
             </w:rPr>
           </w:pPr>
-          <w:hyperlink w:anchor="_Toc225926404" w:history="1">
+          <w:hyperlink w:anchor="_Toc226112850" w:history="1">
             <w:r>
               <w:rPr>
                 <w:rStyle w:val="Hyperlink"/>
@@ -5055,7 +5055,7 @@
                 <w:noProof/>
                 <w:webHidden/>
               </w:rPr>
-              <w:instrText xml:space="preserve"> PAGEREF _Toc225926404 \h </w:instrText>
+              <w:instrText xml:space="preserve"> PAGEREF _Toc226112850 \h </w:instrText>
             </w:r>
             <w:r>
               <w:rPr>
@@ -5102,7 +5102,7 @@
               <w14:ligatures w14:val="standardContextual"/>
             </w:rPr>
           </w:pPr>
-          <w:hyperlink w:anchor="_Toc225926405" w:history="1">
+          <w:hyperlink w:anchor="_Toc226112851" w:history="1">
             <w:r>
               <w:rPr>
                 <w:rStyle w:val="Hyperlink"/>
@@ -5138,7 +5138,7 @@
                 <w:noProof/>
                 <w:webHidden/>
               </w:rPr>
-              <w:instrText xml:space="preserve"> PAGEREF _Toc225926405 \h </w:instrText>
+              <w:instrText xml:space="preserve"> PAGEREF _Toc226112851 \h </w:instrText>
             </w:r>
             <w:r>
               <w:rPr>
@@ -5185,7 +5185,7 @@
               <w14:ligatures w14:val="standardContextual"/>
             </w:rPr>
           </w:pPr>
-          <w:hyperlink w:anchor="_Toc225926406" w:history="1">
+          <w:hyperlink w:anchor="_Toc226112852" w:history="1">
             <w:r>
               <w:rPr>
                 <w:rStyle w:val="Hyperlink"/>
@@ -5221,7 +5221,7 @@
                 <w:noProof/>
                 <w:webHidden/>
               </w:rPr>
-              <w:instrText xml:space="preserve"> PAGEREF _Toc225926406 \h </w:instrText>
+              <w:instrText xml:space="preserve"> PAGEREF _Toc226112852 \h </w:instrText>
             </w:r>
             <w:r>
               <w:rPr>
@@ -5268,7 +5268,7 @@
               <w14:ligatures w14:val="standardContextual"/>
             </w:rPr>
           </w:pPr>
-          <w:hyperlink w:anchor="_Toc225926407" w:history="1">
+          <w:hyperlink w:anchor="_Toc226112853" w:history="1">
             <w:r>
               <w:rPr>
                 <w:rStyle w:val="Hyperlink"/>
@@ -5304,7 +5304,7 @@
                 <w:noProof/>
                 <w:webHidden/>
               </w:rPr>
-              <w:instrText xml:space="preserve"> PAGEREF _Toc225926407 \h </w:instrText>
+              <w:instrText xml:space="preserve"> PAGEREF _Toc226112853 \h </w:instrText>
             </w:r>
             <w:r>
               <w:rPr>
@@ -5353,7 +5353,7 @@
               <w14:ligatures w14:val="standardContextual"/>
             </w:rPr>
           </w:pPr>
-          <w:hyperlink w:anchor="_Toc225926408" w:history="1">
+          <w:hyperlink w:anchor="_Toc226112854" w:history="1">
             <w:r>
               <w:rPr>
                 <w:rStyle w:val="Hyperlink"/>
@@ -5381,7 +5381,7 @@
                 <w:noProof/>
                 <w:webHidden/>
               </w:rPr>
-              <w:instrText xml:space="preserve"> PAGEREF _Toc225926408 \h </w:instrText>
+              <w:instrText xml:space="preserve"> PAGEREF _Toc226112854 \h </w:instrText>
             </w:r>
             <w:r>
               <w:rPr>
@@ -5428,7 +5428,7 @@
               <w14:ligatures w14:val="standardContextual"/>
             </w:rPr>
           </w:pPr>
-          <w:hyperlink w:anchor="_Toc225926409" w:history="1">
+          <w:hyperlink w:anchor="_Toc226112855" w:history="1">
             <w:r>
               <w:rPr>
                 <w:rStyle w:val="Hyperlink"/>
@@ -5464,7 +5464,7 @@
                 <w:noProof/>
                 <w:webHidden/>
               </w:rPr>
-              <w:instrText xml:space="preserve"> PAGEREF _Toc225926409 \h </w:instrText>
+              <w:instrText xml:space="preserve"> PAGEREF _Toc226112855 \h </w:instrText>
             </w:r>
             <w:r>
               <w:rPr>
@@ -5511,7 +5511,7 @@
               <w14:ligatures w14:val="standardContextual"/>
             </w:rPr>
           </w:pPr>
-          <w:hyperlink w:anchor="_Toc225926410" w:history="1">
+          <w:hyperlink w:anchor="_Toc226112856" w:history="1">
             <w:r>
               <w:rPr>
                 <w:rStyle w:val="Hyperlink"/>
@@ -5547,7 +5547,7 @@
                 <w:noProof/>
                 <w:webHidden/>
               </w:rPr>
-              <w:instrText xml:space="preserve"> PAGEREF _Toc225926410 \h </w:instrText>
+              <w:instrText xml:space="preserve"> PAGEREF _Toc226112856 \h </w:instrText>
             </w:r>
             <w:r>
               <w:rPr>
@@ -5594,7 +5594,7 @@
               <w14:ligatures w14:val="standardContextual"/>
             </w:rPr>
           </w:pPr>
-          <w:hyperlink w:anchor="_Toc225926411" w:history="1">
+          <w:hyperlink w:anchor="_Toc226112857" w:history="1">
             <w:r>
               <w:rPr>
                 <w:rStyle w:val="Hyperlink"/>
@@ -5638,7 +5638,7 @@
                 <w:noProof/>
                 <w:webHidden/>
               </w:rPr>
-              <w:instrText xml:space="preserve"> PAGEREF _Toc225926411 \h </w:instrText>
+              <w:instrText xml:space="preserve"> PAGEREF _Toc226112857 \h </w:instrText>
             </w:r>
             <w:r>
               <w:rPr>
@@ -5685,7 +5685,7 @@
               <w14:ligatures w14:val="standardContextual"/>
             </w:rPr>
           </w:pPr>
-          <w:hyperlink w:anchor="_Toc225926412" w:history="1">
+          <w:hyperlink w:anchor="_Toc226112858" w:history="1">
             <w:r>
               <w:rPr>
                 <w:rStyle w:val="Hyperlink"/>
@@ -5720,7 +5720,7 @@
                 <w:noProof/>
                 <w:webHidden/>
               </w:rPr>
-              <w:instrText xml:space="preserve"> PAGEREF _Toc225926412 \h </w:instrText>
+              <w:instrText xml:space="preserve"> PAGEREF _Toc226112858 \h </w:instrText>
             </w:r>
             <w:r>
               <w:rPr>
@@ -5767,7 +5767,7 @@
               <w14:ligatures w14:val="standardContextual"/>
             </w:rPr>
           </w:pPr>
-          <w:hyperlink w:anchor="_Toc225926413" w:history="1">
+          <w:hyperlink w:anchor="_Toc226112859" w:history="1">
             <w:r>
               <w:rPr>
                 <w:rStyle w:val="Hyperlink"/>
@@ -5802,7 +5802,7 @@
                 <w:noProof/>
                 <w:webHidden/>
               </w:rPr>
-              <w:instrText xml:space="preserve"> PAGEREF _Toc225926413 \h </w:instrText>
+              <w:instrText xml:space="preserve"> PAGEREF _Toc226112859 \h </w:instrText>
             </w:r>
             <w:r>
               <w:rPr>
@@ -5851,7 +5851,7 @@
               <w14:ligatures w14:val="standardContextual"/>
             </w:rPr>
           </w:pPr>
-          <w:hyperlink w:anchor="_Toc225926414" w:history="1">
+          <w:hyperlink w:anchor="_Toc226112860" w:history="1">
             <w:r>
               <w:rPr>
                 <w:rStyle w:val="Hyperlink"/>
@@ -5879,7 +5879,7 @@
                 <w:noProof/>
                 <w:webHidden/>
               </w:rPr>
-              <w:instrText xml:space="preserve"> PAGEREF _Toc225926414 \h </w:instrText>
+              <w:instrText xml:space="preserve"> PAGEREF _Toc226112860 \h </w:instrText>
             </w:r>
             <w:r>
               <w:rPr>
@@ -5926,7 +5926,7 @@
               <w14:ligatures w14:val="standardContextual"/>
             </w:rPr>
           </w:pPr>
-          <w:hyperlink w:anchor="_Toc225926415" w:history="1">
+          <w:hyperlink w:anchor="_Toc226112861" w:history="1">
             <w:r>
               <w:rPr>
                 <w:rStyle w:val="Hyperlink"/>
@@ -5961,7 +5961,7 @@
                 <w:noProof/>
                 <w:webHidden/>
               </w:rPr>
-              <w:instrText xml:space="preserve"> PAGEREF _Toc225926415 \h </w:instrText>
+              <w:instrText xml:space="preserve"> PAGEREF _Toc226112861 \h </w:instrText>
             </w:r>
             <w:r>
               <w:rPr>
@@ -6008,7 +6008,7 @@
               <w14:ligatures w14:val="standardContextual"/>
             </w:rPr>
           </w:pPr>
-          <w:hyperlink w:anchor="_Toc225926416" w:history="1">
+          <w:hyperlink w:anchor="_Toc226112862" w:history="1">
             <w:r>
               <w:rPr>
                 <w:rStyle w:val="Hyperlink"/>
@@ -6043,7 +6043,7 @@
                 <w:noProof/>
                 <w:webHidden/>
               </w:rPr>
-              <w:instrText xml:space="preserve"> PAGEREF _Toc225926416 \h </w:instrText>
+              <w:instrText xml:space="preserve"> PAGEREF _Toc226112862 \h </w:instrText>
             </w:r>
             <w:r>
               <w:rPr>
@@ -6090,7 +6090,7 @@
               <w14:ligatures w14:val="standardContextual"/>
             </w:rPr>
           </w:pPr>
-          <w:hyperlink w:anchor="_Toc225926417" w:history="1">
+          <w:hyperlink w:anchor="_Toc226112863" w:history="1">
             <w:r>
               <w:rPr>
                 <w:rStyle w:val="Hyperlink"/>
@@ -6125,7 +6125,7 @@
                 <w:noProof/>
                 <w:webHidden/>
               </w:rPr>
-              <w:instrText xml:space="preserve"> PAGEREF _Toc225926417 \h </w:instrText>
+              <w:instrText xml:space="preserve"> PAGEREF _Toc226112863 \h </w:instrText>
             </w:r>
             <w:r>
               <w:rPr>
@@ -6172,7 +6172,7 @@
               <w14:ligatures w14:val="standardContextual"/>
             </w:rPr>
           </w:pPr>
-          <w:hyperlink w:anchor="_Toc225926418" w:history="1">
+          <w:hyperlink w:anchor="_Toc226112864" w:history="1">
             <w:r>
               <w:rPr>
                 <w:rStyle w:val="Hyperlink"/>
@@ -6207,7 +6207,7 @@
                 <w:noProof/>
                 <w:webHidden/>
               </w:rPr>
-              <w:instrText xml:space="preserve"> PAGEREF _Toc225926418 \h </w:instrText>
+              <w:instrText xml:space="preserve"> PAGEREF _Toc226112864 \h </w:instrText>
             </w:r>
             <w:r>
               <w:rPr>
@@ -6256,7 +6256,7 @@
               <w14:ligatures w14:val="standardContextual"/>
             </w:rPr>
           </w:pPr>
-          <w:hyperlink w:anchor="_Toc225926419" w:history="1">
+          <w:hyperlink w:anchor="_Toc226112865" w:history="1">
             <w:r>
               <w:rPr>
                 <w:rStyle w:val="Hyperlink"/>
@@ -6284,7 +6284,7 @@
                 <w:noProof/>
                 <w:webHidden/>
               </w:rPr>
-              <w:instrText xml:space="preserve"> PAGEREF _Toc225926419 \h </w:instrText>
+              <w:instrText xml:space="preserve"> PAGEREF _Toc226112865 \h </w:instrText>
             </w:r>
             <w:r>
               <w:rPr>
@@ -6331,7 +6331,7 @@
               <w14:ligatures w14:val="standardContextual"/>
             </w:rPr>
           </w:pPr>
-          <w:hyperlink w:anchor="_Toc225926420" w:history="1">
+          <w:hyperlink w:anchor="_Toc226112866" w:history="1">
             <w:r>
               <w:rPr>
                 <w:rStyle w:val="Hyperlink"/>
@@ -6367,7 +6367,7 @@
                 <w:noProof/>
                 <w:webHidden/>
               </w:rPr>
-              <w:instrText xml:space="preserve"> PAGEREF _Toc225926420 \h </w:instrText>
+              <w:instrText xml:space="preserve"> PAGEREF _Toc226112866 \h </w:instrText>
             </w:r>
             <w:r>
               <w:rPr>
@@ -6414,7 +6414,7 @@
               <w14:ligatures w14:val="standardContextual"/>
             </w:rPr>
           </w:pPr>
-          <w:hyperlink w:anchor="_Toc225926421" w:history="1">
+          <w:hyperlink w:anchor="_Toc226112867" w:history="1">
             <w:r>
               <w:rPr>
                 <w:rStyle w:val="Hyperlink"/>
@@ -6450,7 +6450,7 @@
                 <w:noProof/>
                 <w:webHidden/>
               </w:rPr>
-              <w:instrText xml:space="preserve"> PAGEREF _Toc225926421 \h </w:instrText>
+              <w:instrText xml:space="preserve"> PAGEREF _Toc226112867 \h </w:instrText>
             </w:r>
             <w:r>
               <w:rPr>
@@ -6497,7 +6497,7 @@
               <w14:ligatures w14:val="standardContextual"/>
             </w:rPr>
           </w:pPr>
-          <w:hyperlink w:anchor="_Toc225926422" w:history="1">
+          <w:hyperlink w:anchor="_Toc226112868" w:history="1">
             <w:r>
               <w:rPr>
                 <w:rStyle w:val="Hyperlink"/>
@@ -6533,7 +6533,7 @@
                 <w:noProof/>
                 <w:webHidden/>
               </w:rPr>
-              <w:instrText xml:space="preserve"> PAGEREF _Toc225926422 \h </w:instrText>
+              <w:instrText xml:space="preserve"> PAGEREF _Toc226112868 \h </w:instrText>
             </w:r>
             <w:r>
               <w:rPr>
@@ -6580,7 +6580,7 @@
               <w14:ligatures w14:val="standardContextual"/>
             </w:rPr>
           </w:pPr>
-          <w:hyperlink w:anchor="_Toc225926423" w:history="1">
+          <w:hyperlink w:anchor="_Toc226112869" w:history="1">
             <w:r>
               <w:rPr>
                 <w:rStyle w:val="Hyperlink"/>
@@ -6616,7 +6616,7 @@
                 <w:noProof/>
                 <w:webHidden/>
               </w:rPr>
-              <w:instrText xml:space="preserve"> PAGEREF _Toc225926423 \h </w:instrText>
+              <w:instrText xml:space="preserve"> PAGEREF _Toc226112869 \h </w:instrText>
             </w:r>
             <w:r>
               <w:rPr>
@@ -6663,7 +6663,7 @@
               <w14:ligatures w14:val="standardContextual"/>
             </w:rPr>
           </w:pPr>
-          <w:hyperlink w:anchor="_Toc225926424" w:history="1">
+          <w:hyperlink w:anchor="_Toc226112870" w:history="1">
             <w:r>
               <w:rPr>
                 <w:rStyle w:val="Hyperlink"/>
@@ -6699,7 +6699,7 @@
                 <w:noProof/>
                 <w:webHidden/>
               </w:rPr>
-              <w:instrText xml:space="preserve"> PAGEREF _Toc225926424 \h </w:instrText>
+              <w:instrText xml:space="preserve"> PAGEREF _Toc226112870 \h </w:instrText>
             </w:r>
             <w:r>
               <w:rPr>
@@ -6748,7 +6748,7 @@
               <w14:ligatures w14:val="standardContextual"/>
             </w:rPr>
           </w:pPr>
-          <w:hyperlink w:anchor="_Toc225926425" w:history="1">
+          <w:hyperlink w:anchor="_Toc226112871" w:history="1">
             <w:r>
               <w:rPr>
                 <w:rStyle w:val="Hyperlink"/>
@@ -6776,7 +6776,7 @@
                 <w:noProof/>
                 <w:webHidden/>
               </w:rPr>
-              <w:instrText xml:space="preserve"> PAGEREF _Toc225926425 \h </w:instrText>
+              <w:instrText xml:space="preserve"> PAGEREF _Toc226112871 \h </w:instrText>
             </w:r>
             <w:r>
               <w:rPr>
@@ -6823,7 +6823,7 @@
               <w14:ligatures w14:val="standardContextual"/>
             </w:rPr>
           </w:pPr>
-          <w:hyperlink w:anchor="_Toc225926426" w:history="1">
+          <w:hyperlink w:anchor="_Toc226112872" w:history="1">
             <w:r>
               <w:rPr>
                 <w:rStyle w:val="Hyperlink"/>
@@ -6859,7 +6859,7 @@
                 <w:noProof/>
                 <w:webHidden/>
               </w:rPr>
-              <w:instrText xml:space="preserve"> PAGEREF _Toc225926426 \h </w:instrText>
+              <w:instrText xml:space="preserve"> PAGEREF _Toc226112872 \h </w:instrText>
             </w:r>
             <w:r>
               <w:rPr>
@@ -6906,7 +6906,7 @@
               <w14:ligatures w14:val="standardContextual"/>
             </w:rPr>
           </w:pPr>
-          <w:hyperlink w:anchor="_Toc225926427" w:history="1">
+          <w:hyperlink w:anchor="_Toc226112873" w:history="1">
             <w:r>
               <w:rPr>
                 <w:rStyle w:val="Hyperlink"/>
@@ -6942,7 +6942,7 @@
                 <w:noProof/>
                 <w:webHidden/>
               </w:rPr>
-              <w:instrText xml:space="preserve"> PAGEREF _Toc225926427 \h </w:instrText>
+              <w:instrText xml:space="preserve"> PAGEREF _Toc226112873 \h </w:instrText>
             </w:r>
             <w:r>
               <w:rPr>
@@ -6989,7 +6989,7 @@
               <w14:ligatures w14:val="standardContextual"/>
             </w:rPr>
           </w:pPr>
-          <w:hyperlink w:anchor="_Toc225926428" w:history="1">
+          <w:hyperlink w:anchor="_Toc226112874" w:history="1">
             <w:r>
               <w:rPr>
                 <w:rStyle w:val="Hyperlink"/>
@@ -7025,7 +7025,7 @@
                 <w:noProof/>
                 <w:webHidden/>
               </w:rPr>
-              <w:instrText xml:space="preserve"> PAGEREF _Toc225926428 \h </w:instrText>
+              <w:instrText xml:space="preserve"> PAGEREF _Toc226112874 \h </w:instrText>
             </w:r>
             <w:r>
               <w:rPr>
@@ -7072,7 +7072,7 @@
               <w14:ligatures w14:val="standardContextual"/>
             </w:rPr>
           </w:pPr>
-          <w:hyperlink w:anchor="_Toc225926429" w:history="1">
+          <w:hyperlink w:anchor="_Toc226112875" w:history="1">
             <w:r>
               <w:rPr>
                 <w:rStyle w:val="Hyperlink"/>
@@ -7108,7 +7108,7 @@
                 <w:noProof/>
                 <w:webHidden/>
               </w:rPr>
-              <w:instrText xml:space="preserve"> PAGEREF _Toc225926429 \h </w:instrText>
+              <w:instrText xml:space="preserve"> PAGEREF _Toc226112875 \h </w:instrText>
             </w:r>
             <w:r>
               <w:rPr>
@@ -7155,7 +7155,7 @@
               <w14:ligatures w14:val="standardContextual"/>
             </w:rPr>
           </w:pPr>
-          <w:hyperlink w:anchor="_Toc225926430" w:history="1">
+          <w:hyperlink w:anchor="_Toc226112876" w:history="1">
             <w:r>
               <w:rPr>
                 <w:rStyle w:val="Hyperlink"/>
@@ -7191,7 +7191,7 @@
                 <w:noProof/>
                 <w:webHidden/>
               </w:rPr>
-              <w:instrText xml:space="preserve"> PAGEREF _Toc225926430 \h </w:instrText>
+              <w:instrText xml:space="preserve"> PAGEREF _Toc226112876 \h </w:instrText>
             </w:r>
             <w:r>
               <w:rPr>
@@ -7238,7 +7238,7 @@
               <w14:ligatures w14:val="standardContextual"/>
             </w:rPr>
           </w:pPr>
-          <w:hyperlink w:anchor="_Toc225926431" w:history="1">
+          <w:hyperlink w:anchor="_Toc226112877" w:history="1">
             <w:r>
               <w:rPr>
                 <w:rStyle w:val="Hyperlink"/>
@@ -7274,7 +7274,7 @@
                 <w:noProof/>
                 <w:webHidden/>
               </w:rPr>
-              <w:instrText xml:space="preserve"> PAGEREF _Toc225926431 \h </w:instrText>
+              <w:instrText xml:space="preserve"> PAGEREF _Toc226112877 \h </w:instrText>
             </w:r>
             <w:r>
               <w:rPr>
@@ -7323,7 +7323,7 @@
               <w14:ligatures w14:val="standardContextual"/>
             </w:rPr>
           </w:pPr>
-          <w:hyperlink w:anchor="_Toc225926432" w:history="1">
+          <w:hyperlink w:anchor="_Toc226112878" w:history="1">
             <w:r>
               <w:rPr>
                 <w:rStyle w:val="Hyperlink"/>
@@ -7351,7 +7351,7 @@
                 <w:noProof/>
                 <w:webHidden/>
               </w:rPr>
-              <w:instrText xml:space="preserve"> PAGEREF _Toc225926432 \h </w:instrText>
+              <w:instrText xml:space="preserve"> PAGEREF _Toc226112878 \h </w:instrText>
             </w:r>
             <w:r>
               <w:rPr>
@@ -7398,7 +7398,7 @@
               <w14:ligatures w14:val="standardContextual"/>
             </w:rPr>
           </w:pPr>
-          <w:hyperlink w:anchor="_Toc225926433" w:history="1">
+          <w:hyperlink w:anchor="_Toc226112879" w:history="1">
             <w:r>
               <w:rPr>
                 <w:rStyle w:val="Hyperlink"/>
@@ -7434,7 +7434,7 @@
                 <w:noProof/>
                 <w:webHidden/>
               </w:rPr>
-              <w:instrText xml:space="preserve"> PAGEREF _Toc225926433 \h </w:instrText>
+              <w:instrText xml:space="preserve"> PAGEREF _Toc226112879 \h </w:instrText>
             </w:r>
             <w:r>
               <w:rPr>
@@ -7481,7 +7481,7 @@
               <w14:ligatures w14:val="standardContextual"/>
             </w:rPr>
           </w:pPr>
-          <w:hyperlink w:anchor="_Toc225926434" w:history="1">
+          <w:hyperlink w:anchor="_Toc226112880" w:history="1">
             <w:r>
               <w:rPr>
                 <w:rStyle w:val="Hyperlink"/>
@@ -7517,7 +7517,7 @@
                 <w:noProof/>
                 <w:webHidden/>
               </w:rPr>
-              <w:instrText xml:space="preserve"> PAGEREF _Toc225926434 \h </w:instrText>
+              <w:instrText xml:space="preserve"> PAGEREF _Toc226112880 \h </w:instrText>
             </w:r>
             <w:r>
               <w:rPr>
@@ -7564,7 +7564,7 @@
               <w14:ligatures w14:val="standardContextual"/>
             </w:rPr>
           </w:pPr>
-          <w:hyperlink w:anchor="_Toc225926435" w:history="1">
+          <w:hyperlink w:anchor="_Toc226112881" w:history="1">
             <w:r>
               <w:rPr>
                 <w:rStyle w:val="Hyperlink"/>
@@ -7600,7 +7600,7 @@
                 <w:noProof/>
                 <w:webHidden/>
               </w:rPr>
-              <w:instrText xml:space="preserve"> PAGEREF _Toc225926435 \h </w:instrText>
+              <w:instrText xml:space="preserve"> PAGEREF _Toc226112881 \h </w:instrText>
             </w:r>
             <w:r>
               <w:rPr>
@@ -7647,7 +7647,7 @@
               <w14:ligatures w14:val="standardContextual"/>
             </w:rPr>
           </w:pPr>
-          <w:hyperlink w:anchor="_Toc225926436" w:history="1">
+          <w:hyperlink w:anchor="_Toc226112882" w:history="1">
             <w:r>
               <w:rPr>
                 <w:rStyle w:val="Hyperlink"/>
@@ -7683,7 +7683,7 @@
                 <w:noProof/>
                 <w:webHidden/>
               </w:rPr>
-              <w:instrText xml:space="preserve"> PAGEREF _Toc225926436 \h </w:instrText>
+              <w:instrText xml:space="preserve"> PAGEREF _Toc226112882 \h </w:instrText>
             </w:r>
             <w:r>
               <w:rPr>
@@ -7730,7 +7730,7 @@
               <w14:ligatures w14:val="standardContextual"/>
             </w:rPr>
           </w:pPr>
-          <w:hyperlink w:anchor="_Toc225926437" w:history="1">
+          <w:hyperlink w:anchor="_Toc226112883" w:history="1">
             <w:r>
               <w:rPr>
                 <w:rStyle w:val="Hyperlink"/>
@@ -7766,7 +7766,7 @@
                 <w:noProof/>
                 <w:webHidden/>
               </w:rPr>
-              <w:instrText xml:space="preserve"> PAGEREF _Toc225926437 \h </w:instrText>
+              <w:instrText xml:space="preserve"> PAGEREF _Toc226112883 \h </w:instrText>
             </w:r>
             <w:r>
               <w:rPr>
@@ -7813,7 +7813,7 @@
               <w14:ligatures w14:val="standardContextual"/>
             </w:rPr>
           </w:pPr>
-          <w:hyperlink w:anchor="_Toc225926438" w:history="1">
+          <w:hyperlink w:anchor="_Toc226112884" w:history="1">
             <w:r>
               <w:rPr>
                 <w:rStyle w:val="Hyperlink"/>
@@ -7849,7 +7849,7 @@
                 <w:noProof/>
                 <w:webHidden/>
               </w:rPr>
-              <w:instrText xml:space="preserve"> PAGEREF _Toc225926438 \h </w:instrText>
+              <w:instrText xml:space="preserve"> PAGEREF _Toc226112884 \h </w:instrText>
             </w:r>
             <w:r>
               <w:rPr>
@@ -7896,7 +7896,7 @@
               <w14:ligatures w14:val="standardContextual"/>
             </w:rPr>
           </w:pPr>
-          <w:hyperlink w:anchor="_Toc225926439" w:history="1">
+          <w:hyperlink w:anchor="_Toc226112885" w:history="1">
             <w:r>
               <w:rPr>
                 <w:rStyle w:val="Hyperlink"/>
@@ -7932,7 +7932,7 @@
                 <w:noProof/>
                 <w:webHidden/>
               </w:rPr>
-              <w:instrText xml:space="preserve"> PAGEREF _Toc225926439 \h </w:instrText>
+              <w:instrText xml:space="preserve"> PAGEREF _Toc226112885 \h </w:instrText>
             </w:r>
             <w:r>
               <w:rPr>
@@ -7979,7 +7979,7 @@
               <w14:ligatures w14:val="standardContextual"/>
             </w:rPr>
           </w:pPr>
-          <w:hyperlink w:anchor="_Toc225926440" w:history="1">
+          <w:hyperlink w:anchor="_Toc226112886" w:history="1">
             <w:r>
               <w:rPr>
                 <w:rStyle w:val="Hyperlink"/>
@@ -8015,7 +8015,7 @@
                 <w:noProof/>
                 <w:webHidden/>
               </w:rPr>
-              <w:instrText xml:space="preserve"> PAGEREF _Toc225926440 \h </w:instrText>
+              <w:instrText xml:space="preserve"> PAGEREF _Toc226112886 \h </w:instrText>
             </w:r>
             <w:r>
               <w:rPr>
@@ -8062,7 +8062,7 @@
               <w14:ligatures w14:val="standardContextual"/>
             </w:rPr>
           </w:pPr>
-          <w:hyperlink w:anchor="_Toc225926441" w:history="1">
+          <w:hyperlink w:anchor="_Toc226112887" w:history="1">
             <w:r>
               <w:rPr>
                 <w:rStyle w:val="Hyperlink"/>
@@ -8098,7 +8098,7 @@
                 <w:noProof/>
                 <w:webHidden/>
               </w:rPr>
-              <w:instrText xml:space="preserve"> PAGEREF _Toc225926441 \h </w:instrText>
+              <w:instrText xml:space="preserve"> PAGEREF _Toc226112887 \h </w:instrText>
             </w:r>
             <w:r>
               <w:rPr>
@@ -8147,7 +8147,7 @@
               <w14:ligatures w14:val="standardContextual"/>
             </w:rPr>
           </w:pPr>
-          <w:hyperlink w:anchor="_Toc225926442" w:history="1">
+          <w:hyperlink w:anchor="_Toc226112888" w:history="1">
             <w:r>
               <w:rPr>
                 <w:rStyle w:val="Hyperlink"/>
@@ -8175,7 +8175,7 @@
                 <w:noProof/>
                 <w:webHidden/>
               </w:rPr>
-              <w:instrText xml:space="preserve"> PAGEREF _Toc225926442 \h </w:instrText>
+              <w:instrText xml:space="preserve"> PAGEREF _Toc226112888 \h </w:instrText>
             </w:r>
             <w:r>
               <w:rPr>
@@ -8222,7 +8222,7 @@
               <w14:ligatures w14:val="standardContextual"/>
             </w:rPr>
           </w:pPr>
-          <w:hyperlink w:anchor="_Toc225926443" w:history="1">
+          <w:hyperlink w:anchor="_Toc226112889" w:history="1">
             <w:r>
               <w:rPr>
                 <w:rStyle w:val="Hyperlink"/>
@@ -8258,7 +8258,7 @@
                 <w:noProof/>
                 <w:webHidden/>
               </w:rPr>
-              <w:instrText xml:space="preserve"> PAGEREF _Toc225926443 \h </w:instrText>
+              <w:instrText xml:space="preserve"> PAGEREF _Toc226112889 \h </w:instrText>
             </w:r>
             <w:r>
               <w:rPr>
@@ -8305,7 +8305,7 @@
               <w14:ligatures w14:val="standardContextual"/>
             </w:rPr>
           </w:pPr>
-          <w:hyperlink w:anchor="_Toc225926444" w:history="1">
+          <w:hyperlink w:anchor="_Toc226112890" w:history="1">
             <w:r>
               <w:rPr>
                 <w:rStyle w:val="Hyperlink"/>
@@ -8341,7 +8341,7 @@
                 <w:noProof/>
                 <w:webHidden/>
               </w:rPr>
-              <w:instrText xml:space="preserve"> PAGEREF _Toc225926444 \h </w:instrText>
+              <w:instrText xml:space="preserve"> PAGEREF _Toc226112890 \h </w:instrText>
             </w:r>
             <w:r>
               <w:rPr>
@@ -8388,7 +8388,7 @@
               <w14:ligatures w14:val="standardContextual"/>
             </w:rPr>
           </w:pPr>
-          <w:hyperlink w:anchor="_Toc225926445" w:history="1">
+          <w:hyperlink w:anchor="_Toc226112891" w:history="1">
             <w:r>
               <w:rPr>
                 <w:rStyle w:val="Hyperlink"/>
@@ -8424,7 +8424,7 @@
                 <w:noProof/>
                 <w:webHidden/>
               </w:rPr>
-              <w:instrText xml:space="preserve"> PAGEREF _Toc225926445 \h </w:instrText>
+              <w:instrText xml:space="preserve"> PAGEREF _Toc226112891 \h </w:instrText>
             </w:r>
             <w:r>
               <w:rPr>
@@ -8471,7 +8471,7 @@
               <w14:ligatures w14:val="standardContextual"/>
             </w:rPr>
           </w:pPr>
-          <w:hyperlink w:anchor="_Toc225926446" w:history="1">
+          <w:hyperlink w:anchor="_Toc226112892" w:history="1">
             <w:r>
               <w:rPr>
                 <w:rStyle w:val="Hyperlink"/>
@@ -8507,7 +8507,7 @@
                 <w:noProof/>
                 <w:webHidden/>
               </w:rPr>
-              <w:instrText xml:space="preserve"> PAGEREF _Toc225926446 \h </w:instrText>
+              <w:instrText xml:space="preserve"> PAGEREF _Toc226112892 \h </w:instrText>
             </w:r>
             <w:r>
               <w:rPr>
@@ -8554,7 +8554,7 @@
               <w14:ligatures w14:val="standardContextual"/>
             </w:rPr>
           </w:pPr>
-          <w:hyperlink w:anchor="_Toc225926447" w:history="1">
+          <w:hyperlink w:anchor="_Toc226112893" w:history="1">
             <w:r>
               <w:rPr>
                 <w:rStyle w:val="Hyperlink"/>
@@ -8590,7 +8590,7 @@
                 <w:noProof/>
                 <w:webHidden/>
               </w:rPr>
-              <w:instrText xml:space="preserve"> PAGEREF _Toc225926447 \h </w:instrText>
+              <w:instrText xml:space="preserve"> PAGEREF _Toc226112893 \h </w:instrText>
             </w:r>
             <w:r>
               <w:rPr>
@@ -8639,7 +8639,7 @@
               <w14:ligatures w14:val="standardContextual"/>
             </w:rPr>
           </w:pPr>
-          <w:hyperlink w:anchor="_Toc225926448" w:history="1">
+          <w:hyperlink w:anchor="_Toc226112894" w:history="1">
             <w:r>
               <w:rPr>
                 <w:rStyle w:val="Hyperlink"/>
@@ -8675,7 +8675,7 @@
                 <w:noProof/>
                 <w:webHidden/>
               </w:rPr>
-              <w:instrText xml:space="preserve"> PAGEREF _Toc225926448 \h </w:instrText>
+              <w:instrText xml:space="preserve"> PAGEREF _Toc226112894 \h </w:instrText>
             </w:r>
             <w:r>
               <w:rPr>
@@ -8722,7 +8722,7 @@
               <w14:ligatures w14:val="standardContextual"/>
             </w:rPr>
           </w:pPr>
-          <w:hyperlink w:anchor="_Toc225926449" w:history="1">
+          <w:hyperlink w:anchor="_Toc226112895" w:history="1">
             <w:r>
               <w:rPr>
                 <w:rStyle w:val="Hyperlink"/>
@@ -8758,7 +8758,7 @@
                 <w:noProof/>
                 <w:webHidden/>
               </w:rPr>
-              <w:instrText xml:space="preserve"> PAGEREF _Toc225926449 \h </w:instrText>
+              <w:instrText xml:space="preserve"> PAGEREF _Toc226112895 \h </w:instrText>
             </w:r>
             <w:r>
               <w:rPr>
@@ -8805,7 +8805,7 @@
               <w14:ligatures w14:val="standardContextual"/>
             </w:rPr>
           </w:pPr>
-          <w:hyperlink w:anchor="_Toc225926450" w:history="1">
+          <w:hyperlink w:anchor="_Toc226112896" w:history="1">
             <w:r>
               <w:rPr>
                 <w:rStyle w:val="Hyperlink"/>
@@ -8841,7 +8841,7 @@
                 <w:noProof/>
                 <w:webHidden/>
               </w:rPr>
-              <w:instrText xml:space="preserve"> PAGEREF _Toc225926450 \h </w:instrText>
+              <w:instrText xml:space="preserve"> PAGEREF _Toc226112896 \h </w:instrText>
             </w:r>
             <w:r>
               <w:rPr>
@@ -8888,7 +8888,7 @@
               <w14:ligatures w14:val="standardContextual"/>
             </w:rPr>
           </w:pPr>
-          <w:hyperlink w:anchor="_Toc225926451" w:history="1">
+          <w:hyperlink w:anchor="_Toc226112897" w:history="1">
             <w:r>
               <w:rPr>
                 <w:rStyle w:val="Hyperlink"/>
@@ -8924,7 +8924,7 @@
                 <w:noProof/>
                 <w:webHidden/>
               </w:rPr>
-              <w:instrText xml:space="preserve"> PAGEREF _Toc225926451 \h </w:instrText>
+              <w:instrText xml:space="preserve"> PAGEREF _Toc226112897 \h </w:instrText>
             </w:r>
             <w:r>
               <w:rPr>
@@ -8971,7 +8971,7 @@
               <w14:ligatures w14:val="standardContextual"/>
             </w:rPr>
           </w:pPr>
-          <w:hyperlink w:anchor="_Toc225926452" w:history="1">
+          <w:hyperlink w:anchor="_Toc226112898" w:history="1">
             <w:r>
               <w:rPr>
                 <w:rStyle w:val="Hyperlink"/>
@@ -9007,7 +9007,7 @@
                 <w:noProof/>
                 <w:webHidden/>
               </w:rPr>
-              <w:instrText xml:space="preserve"> PAGEREF _Toc225926452 \h </w:instrText>
+              <w:instrText xml:space="preserve"> PAGEREF _Toc226112898 \h </w:instrText>
             </w:r>
             <w:r>
               <w:rPr>
@@ -9054,7 +9054,7 @@
               <w14:ligatures w14:val="standardContextual"/>
             </w:rPr>
           </w:pPr>
-          <w:hyperlink w:anchor="_Toc225926453" w:history="1">
+          <w:hyperlink w:anchor="_Toc226112899" w:history="1">
             <w:r>
               <w:rPr>
                 <w:rStyle w:val="Hyperlink"/>
@@ -9090,7 +9090,7 @@
                 <w:noProof/>
                 <w:webHidden/>
               </w:rPr>
-              <w:instrText xml:space="preserve"> PAGEREF _Toc225926453 \h </w:instrText>
+              <w:instrText xml:space="preserve"> PAGEREF _Toc226112899 \h </w:instrText>
             </w:r>
             <w:r>
               <w:rPr>
@@ -9137,7 +9137,7 @@
               <w14:ligatures w14:val="standardContextual"/>
             </w:rPr>
           </w:pPr>
-          <w:hyperlink w:anchor="_Toc225926454" w:history="1">
+          <w:hyperlink w:anchor="_Toc226112900" w:history="1">
             <w:r>
               <w:rPr>
                 <w:rStyle w:val="Hyperlink"/>
@@ -9172,7 +9172,7 @@
                 <w:noProof/>
                 <w:webHidden/>
               </w:rPr>
-              <w:instrText xml:space="preserve"> PAGEREF _Toc225926454 \h </w:instrText>
+              <w:instrText xml:space="preserve"> PAGEREF _Toc226112900 \h </w:instrText>
             </w:r>
             <w:r>
               <w:rPr>
@@ -9284,7 +9284,7 @@
           <w:lang w:val="en-GB"/>
         </w:rPr>
       </w:pPr>
-      <w:bookmarkStart w:id="0" w:name="_Toc225926349"/>
+      <w:bookmarkStart w:id="0" w:name="_Toc226112795"/>
       <w:r>
         <w:rPr>
           <w:b/>
@@ -9698,7 +9698,7 @@
                 <w:lang w:val="en-GB"/>
               </w:rPr>
             </w:pPr>
-            <w:bookmarkStart w:id="1" w:name="_Toc225926350"/>
+            <w:bookmarkStart w:id="1" w:name="_Toc226112796"/>
             <w:r>
               <w:rPr>
                 <w:b/>
@@ -9823,7 +9823,7 @@
               <w:pStyle w:val="Heading2"/>
             </w:pPr>
             <w:bookmarkStart w:id="2" w:name="_Toc146100629"/>
-            <w:bookmarkStart w:id="3" w:name="_Toc225926351"/>
+            <w:bookmarkStart w:id="3" w:name="_Toc226112797"/>
             <w:r>
               <w:t>F</w:t>
             </w:r>
@@ -10053,7 +10053,7 @@
             <w:pPr>
               <w:pStyle w:val="Heading2"/>
             </w:pPr>
-            <w:bookmarkStart w:id="4" w:name="_Toc225926352"/>
+            <w:bookmarkStart w:id="4" w:name="_Toc226112798"/>
             <w:r>
               <w:t>F</w:t>
             </w:r>
@@ -10335,7 +10335,7 @@
             <w:pPr>
               <w:pStyle w:val="Heading2"/>
             </w:pPr>
-            <w:bookmarkStart w:id="5" w:name="_Toc225926353"/>
+            <w:bookmarkStart w:id="5" w:name="_Toc226112799"/>
             <w:r>
               <w:t>F</w:t>
             </w:r>
@@ -10406,16 +10406,7 @@
         <w:t xml:space="preserve">Method to </w:t>
       </w:r>
       <w:r>
-        <w:t xml:space="preserve">get the </w:t>
-      </w:r>
-      <w:r>
-        <w:t xml:space="preserve">title of the </w:t>
-      </w:r>
-      <w:r>
-        <w:t xml:space="preserve">current </w:t>
-      </w:r>
-      <w:r>
-        <w:t>web page</w:t>
+        <w:t>get the title of the current web page</w:t>
       </w:r>
     </w:p>
     <w:p>
@@ -10472,13 +10463,7 @@
           </w:tcPr>
           <w:p>
             <w:r>
-              <w:t xml:space="preserve">The name of the variable to store the </w:t>
-            </w:r>
-            <w:r>
-              <w:t>title</w:t>
-            </w:r>
-            <w:r>
-              <w:t xml:space="preserve"> (starting with $)</w:t>
+              <w:t>The name of the variable to store the title (starting with $)</w:t>
             </w:r>
           </w:p>
         </w:tc>
@@ -10521,16 +10506,7 @@
           <w:p>
             <w:proofErr w:type="spellStart"/>
             <w:r>
-              <w:t>get</w:t>
-            </w:r>
-            <w:r>
-              <w:t>U</w:t>
-            </w:r>
-            <w:r>
-              <w:t>rl</w:t>
-            </w:r>
-            <w:r>
-              <w:t>Title</w:t>
+              <w:t>getUrlTitle</w:t>
             </w:r>
             <w:proofErr w:type="spellEnd"/>
           </w:p>
@@ -10541,10 +10517,7 @@
           </w:tcPr>
           <w:p>
             <w:r>
-              <w:t>$</w:t>
-            </w:r>
-            <w:r>
-              <w:t>Title</w:t>
+              <w:t>$Title</w:t>
             </w:r>
           </w:p>
         </w:tc>
@@ -10554,22 +10527,7 @@
           </w:tcPr>
           <w:p>
             <w:r>
-              <w:t xml:space="preserve">Store the </w:t>
-            </w:r>
-            <w:r>
-              <w:t xml:space="preserve">title of </w:t>
-            </w:r>
-            <w:r>
-              <w:t xml:space="preserve"> </w:t>
-            </w:r>
-            <w:r>
-              <w:t xml:space="preserve">the current web page </w:t>
-            </w:r>
-            <w:r>
-              <w:t>into the variable $</w:t>
-            </w:r>
-            <w:r>
-              <w:t>Title</w:t>
+              <w:t>Store the title of  the current web page into the variable $Title</w:t>
             </w:r>
           </w:p>
         </w:tc>
@@ -10594,13 +10552,7 @@
         <w:t>#get</w:t>
       </w:r>
       <w:r>
-        <w:t>U</w:t>
-      </w:r>
-      <w:r>
-        <w:t>rl</w:t>
-      </w:r>
-      <w:r>
-        <w:t>Title</w:t>
+        <w:t>UrlTitle</w:t>
       </w:r>
       <w:r>
         <w:t>: §</w:t>
@@ -10640,7 +10592,7 @@
             <w:r>
               <w:br w:type="page"/>
             </w:r>
-            <w:bookmarkStart w:id="6" w:name="_Toc225926354"/>
+            <w:bookmarkStart w:id="6" w:name="_Toc226112800"/>
             <w:r>
               <w:t>F</w:t>
             </w:r>
@@ -10899,7 +10851,7 @@
             <w:r>
               <w:br w:type="page"/>
             </w:r>
-            <w:bookmarkStart w:id="7" w:name="_Toc225926355"/>
+            <w:bookmarkStart w:id="7" w:name="_Toc226112801"/>
             <w:r>
               <w:t>F</w:t>
             </w:r>
@@ -11146,7 +11098,7 @@
             <w:r>
               <w:br w:type="page"/>
             </w:r>
-            <w:bookmarkStart w:id="8" w:name="_Toc225926356"/>
+            <w:bookmarkStart w:id="8" w:name="_Toc226112802"/>
             <w:r>
               <w:t>F</w:t>
             </w:r>
@@ -11401,7 +11353,7 @@
             <w:r>
               <w:br w:type="page"/>
             </w:r>
-            <w:bookmarkStart w:id="9" w:name="_Toc225926357"/>
+            <w:bookmarkStart w:id="9" w:name="_Toc226112803"/>
             <w:r>
               <w:t>F</w:t>
             </w:r>
@@ -11548,7 +11500,7 @@
             <w:pPr>
               <w:pStyle w:val="Heading2"/>
             </w:pPr>
-            <w:bookmarkStart w:id="10" w:name="_Toc225926358"/>
+            <w:bookmarkStart w:id="10" w:name="_Toc226112804"/>
             <w:r>
               <w:lastRenderedPageBreak/>
               <w:t>F</w:t>
@@ -12138,7 +12090,7 @@
             <w:pPr>
               <w:pStyle w:val="Heading2"/>
             </w:pPr>
-            <w:bookmarkStart w:id="11" w:name="_Toc225926359"/>
+            <w:bookmarkStart w:id="11" w:name="_Toc226112805"/>
             <w:r>
               <w:lastRenderedPageBreak/>
               <w:t>F</w:t>
@@ -12653,7 +12605,7 @@
             <w:pPr>
               <w:pStyle w:val="Heading2"/>
             </w:pPr>
-            <w:bookmarkStart w:id="12" w:name="_Toc225926360"/>
+            <w:bookmarkStart w:id="12" w:name="_Toc226112806"/>
             <w:r>
               <w:lastRenderedPageBreak/>
               <w:t>F</w:t>
@@ -13051,7 +13003,7 @@
             <w:pPr>
               <w:pStyle w:val="Heading2"/>
             </w:pPr>
-            <w:bookmarkStart w:id="13" w:name="_Toc225926361"/>
+            <w:bookmarkStart w:id="13" w:name="_Toc226112807"/>
             <w:r>
               <w:t>F</w:t>
             </w:r>
@@ -13401,7 +13353,7 @@
             <w:pPr>
               <w:pStyle w:val="Heading2"/>
             </w:pPr>
-            <w:bookmarkStart w:id="14" w:name="_Toc225926362"/>
+            <w:bookmarkStart w:id="14" w:name="_Toc226112808"/>
             <w:r>
               <w:t>F</w:t>
             </w:r>
@@ -13634,7 +13586,7 @@
             <w:pPr>
               <w:pStyle w:val="Heading2"/>
             </w:pPr>
-            <w:bookmarkStart w:id="15" w:name="_Toc225926363"/>
+            <w:bookmarkStart w:id="15" w:name="_Toc226112809"/>
             <w:r>
               <w:t>F</w:t>
             </w:r>
@@ -13845,7 +13797,7 @@
                 <w:lang w:val="en-GB"/>
               </w:rPr>
             </w:pPr>
-            <w:bookmarkStart w:id="16" w:name="_Toc225926364"/>
+            <w:bookmarkStart w:id="16" w:name="_Toc226112810"/>
             <w:r>
               <w:rPr>
                 <w:b/>
@@ -13976,7 +13928,7 @@
             <w:pPr>
               <w:pStyle w:val="Heading2"/>
             </w:pPr>
-            <w:bookmarkStart w:id="17" w:name="_Toc225926365"/>
+            <w:bookmarkStart w:id="17" w:name="_Toc226112811"/>
             <w:r>
               <w:t>F</w:t>
             </w:r>
@@ -14445,7 +14397,7 @@
             <w:pPr>
               <w:pStyle w:val="Heading2"/>
             </w:pPr>
-            <w:bookmarkStart w:id="18" w:name="_Toc225926366"/>
+            <w:bookmarkStart w:id="18" w:name="_Toc226112812"/>
             <w:r>
               <w:t>F</w:t>
             </w:r>
@@ -14649,7 +14601,7 @@
             <w:pPr>
               <w:pStyle w:val="Heading2"/>
             </w:pPr>
-            <w:bookmarkStart w:id="19" w:name="_Toc225926367"/>
+            <w:bookmarkStart w:id="19" w:name="_Toc226112813"/>
             <w:r>
               <w:lastRenderedPageBreak/>
               <w:t>F</w:t>
@@ -14938,7 +14890,7 @@
             <w:pPr>
               <w:pStyle w:val="Heading2"/>
             </w:pPr>
-            <w:bookmarkStart w:id="20" w:name="_Toc225926368"/>
+            <w:bookmarkStart w:id="20" w:name="_Toc226112814"/>
             <w:r>
               <w:t>F</w:t>
             </w:r>
@@ -15228,7 +15180,7 @@
             <w:pPr>
               <w:pStyle w:val="Heading2"/>
             </w:pPr>
-            <w:bookmarkStart w:id="21" w:name="_Toc225926369"/>
+            <w:bookmarkStart w:id="21" w:name="_Toc226112815"/>
             <w:r>
               <w:lastRenderedPageBreak/>
               <w:t>F</w:t>
@@ -15512,7 +15464,7 @@
             <w:pPr>
               <w:pStyle w:val="Heading2"/>
             </w:pPr>
-            <w:bookmarkStart w:id="22" w:name="_Toc225926370"/>
+            <w:bookmarkStart w:id="22" w:name="_Toc226112816"/>
             <w:r>
               <w:t>F</w:t>
             </w:r>
@@ -15774,7 +15726,7 @@
             <w:pPr>
               <w:pStyle w:val="Heading2"/>
             </w:pPr>
-            <w:bookmarkStart w:id="23" w:name="_Toc225926371"/>
+            <w:bookmarkStart w:id="23" w:name="_Toc226112817"/>
             <w:r>
               <w:t>F</w:t>
             </w:r>
@@ -16040,7 +15992,7 @@
             <w:pPr>
               <w:pStyle w:val="Heading2"/>
             </w:pPr>
-            <w:bookmarkStart w:id="24" w:name="_Toc225926372"/>
+            <w:bookmarkStart w:id="24" w:name="_Toc226112818"/>
             <w:r>
               <w:t>F</w:t>
             </w:r>
@@ -16253,7 +16205,7 @@
             <w:pPr>
               <w:pStyle w:val="Heading2"/>
             </w:pPr>
-            <w:bookmarkStart w:id="25" w:name="_Toc225926373"/>
+            <w:bookmarkStart w:id="25" w:name="_Toc226112819"/>
             <w:r>
               <w:t>F</w:t>
             </w:r>
@@ -16499,7 +16451,7 @@
             <w:pPr>
               <w:pStyle w:val="Heading2"/>
             </w:pPr>
-            <w:bookmarkStart w:id="26" w:name="_Toc225926374"/>
+            <w:bookmarkStart w:id="26" w:name="_Toc226112820"/>
             <w:r>
               <w:t>F</w:t>
             </w:r>
@@ -16796,7 +16748,7 @@
             <w:pPr>
               <w:pStyle w:val="Heading2"/>
             </w:pPr>
-            <w:bookmarkStart w:id="27" w:name="_Toc225926375"/>
+            <w:bookmarkStart w:id="27" w:name="_Toc226112821"/>
             <w:r>
               <w:t>F</w:t>
             </w:r>
@@ -17156,7 +17108,7 @@
             <w:pPr>
               <w:pStyle w:val="Heading2"/>
             </w:pPr>
-            <w:bookmarkStart w:id="28" w:name="_Toc225926376"/>
+            <w:bookmarkStart w:id="28" w:name="_Toc226112822"/>
             <w:r>
               <w:t>F</w:t>
             </w:r>
@@ -17401,7 +17353,7 @@
             <w:pPr>
               <w:pStyle w:val="Heading2"/>
             </w:pPr>
-            <w:bookmarkStart w:id="29" w:name="_Toc225926377"/>
+            <w:bookmarkStart w:id="29" w:name="_Toc226112823"/>
             <w:r>
               <w:lastRenderedPageBreak/>
               <w:t>F</w:t>
@@ -17660,7 +17612,7 @@
             <w:pPr>
               <w:pStyle w:val="Heading2"/>
             </w:pPr>
-            <w:bookmarkStart w:id="30" w:name="_Toc225926378"/>
+            <w:bookmarkStart w:id="30" w:name="_Toc226112824"/>
             <w:r>
               <w:t>F</w:t>
             </w:r>
@@ -17870,7 +17822,7 @@
             <w:pPr>
               <w:pStyle w:val="Heading2"/>
             </w:pPr>
-            <w:bookmarkStart w:id="31" w:name="_Toc225926379"/>
+            <w:bookmarkStart w:id="31" w:name="_Toc226112825"/>
             <w:r>
               <w:lastRenderedPageBreak/>
               <w:t>F</w:t>
@@ -18062,7 +18014,7 @@
             <w:pPr>
               <w:pStyle w:val="Heading2"/>
             </w:pPr>
-            <w:bookmarkStart w:id="32" w:name="_Toc225926380"/>
+            <w:bookmarkStart w:id="32" w:name="_Toc226112826"/>
             <w:r>
               <w:t>F</w:t>
             </w:r>
@@ -18254,7 +18206,7 @@
             <w:pPr>
               <w:pStyle w:val="Heading2"/>
             </w:pPr>
-            <w:bookmarkStart w:id="33" w:name="_Toc225926381"/>
+            <w:bookmarkStart w:id="33" w:name="_Toc226112827"/>
             <w:r>
               <w:t>F</w:t>
             </w:r>
@@ -18461,7 +18413,7 @@
             <w:pPr>
               <w:pStyle w:val="Heading2"/>
             </w:pPr>
-            <w:bookmarkStart w:id="34" w:name="_Toc225926382"/>
+            <w:bookmarkStart w:id="34" w:name="_Toc226112828"/>
             <w:r>
               <w:t>F</w:t>
             </w:r>
@@ -18655,7 +18607,7 @@
             <w:pPr>
               <w:pStyle w:val="Heading2"/>
             </w:pPr>
-            <w:bookmarkStart w:id="35" w:name="_Toc225926383"/>
+            <w:bookmarkStart w:id="35" w:name="_Toc226112829"/>
             <w:r>
               <w:t>F</w:t>
             </w:r>
@@ -18858,7 +18810,7 @@
             <w:pPr>
               <w:pStyle w:val="Heading2"/>
             </w:pPr>
-            <w:bookmarkStart w:id="36" w:name="_Toc225926384"/>
+            <w:bookmarkStart w:id="36" w:name="_Toc226112830"/>
             <w:r>
               <w:lastRenderedPageBreak/>
               <w:t>F</w:t>
@@ -19172,7 +19124,7 @@
                 <w:lang w:val="en-BE"/>
               </w:rPr>
             </w:pPr>
-            <w:bookmarkStart w:id="37" w:name="_Toc225926385"/>
+            <w:bookmarkStart w:id="37" w:name="_Toc226112831"/>
             <w:r>
               <w:t>F</w:t>
             </w:r>
@@ -19413,7 +19365,7 @@
             <w:pPr>
               <w:pStyle w:val="Heading2"/>
             </w:pPr>
-            <w:bookmarkStart w:id="38" w:name="_Toc225926386"/>
+            <w:bookmarkStart w:id="38" w:name="_Toc226112832"/>
             <w:r>
               <w:lastRenderedPageBreak/>
               <w:t>F</w:t>
@@ -19707,7 +19659,7 @@
             <w:pPr>
               <w:pStyle w:val="Heading2"/>
             </w:pPr>
-            <w:bookmarkStart w:id="39" w:name="_Toc225926387"/>
+            <w:bookmarkStart w:id="39" w:name="_Toc226112833"/>
             <w:r>
               <w:t>F</w:t>
             </w:r>
@@ -20007,7 +19959,7 @@
             <w:pPr>
               <w:pStyle w:val="Heading2"/>
             </w:pPr>
-            <w:bookmarkStart w:id="40" w:name="_Toc225926388"/>
+            <w:bookmarkStart w:id="40" w:name="_Toc226112834"/>
             <w:r>
               <w:t>F</w:t>
             </w:r>
@@ -20259,7 +20211,7 @@
             <w:pPr>
               <w:pStyle w:val="Heading2"/>
             </w:pPr>
-            <w:bookmarkStart w:id="41" w:name="_Toc225926389"/>
+            <w:bookmarkStart w:id="41" w:name="_Toc226112835"/>
             <w:r>
               <w:t>F</w:t>
             </w:r>
@@ -20514,7 +20466,7 @@
             <w:pPr>
               <w:pStyle w:val="Heading2"/>
             </w:pPr>
-            <w:bookmarkStart w:id="42" w:name="_Toc225926390"/>
+            <w:bookmarkStart w:id="42" w:name="_Toc226112836"/>
             <w:r>
               <w:t>F</w:t>
             </w:r>
@@ -20758,7 +20710,7 @@
             <w:pPr>
               <w:pStyle w:val="Heading2"/>
             </w:pPr>
-            <w:bookmarkStart w:id="43" w:name="_Toc225926391"/>
+            <w:bookmarkStart w:id="43" w:name="_Toc226112837"/>
             <w:r>
               <w:t>F</w:t>
             </w:r>
@@ -21032,7 +20984,7 @@
             <w:pPr>
               <w:pStyle w:val="Heading2"/>
             </w:pPr>
-            <w:bookmarkStart w:id="44" w:name="_Toc225926392"/>
+            <w:bookmarkStart w:id="44" w:name="_Toc226112838"/>
             <w:r>
               <w:t>F</w:t>
             </w:r>
@@ -21432,7 +21384,7 @@
             <w:pPr>
               <w:pStyle w:val="Heading2"/>
             </w:pPr>
-            <w:bookmarkStart w:id="45" w:name="_Toc225926393"/>
+            <w:bookmarkStart w:id="45" w:name="_Toc226112839"/>
             <w:r>
               <w:t>F</w:t>
             </w:r>
@@ -22114,7 +22066,7 @@
                 <w:lang w:val="en-GB"/>
               </w:rPr>
             </w:pPr>
-            <w:bookmarkStart w:id="46" w:name="_Toc225926394"/>
+            <w:bookmarkStart w:id="46" w:name="_Toc226112840"/>
             <w:r>
               <w:rPr>
                 <w:b/>
@@ -22252,7 +22204,7 @@
             <w:pPr>
               <w:pStyle w:val="Heading2"/>
             </w:pPr>
-            <w:bookmarkStart w:id="47" w:name="_Toc225926395"/>
+            <w:bookmarkStart w:id="47" w:name="_Toc226112841"/>
             <w:r>
               <w:t>F</w:t>
             </w:r>
@@ -22555,7 +22507,7 @@
             <w:pPr>
               <w:pStyle w:val="Heading2"/>
             </w:pPr>
-            <w:bookmarkStart w:id="48" w:name="_Toc225926396"/>
+            <w:bookmarkStart w:id="48" w:name="_Toc226112842"/>
             <w:r>
               <w:t>F</w:t>
             </w:r>
@@ -22861,7 +22813,7 @@
             <w:pPr>
               <w:pStyle w:val="Heading2"/>
             </w:pPr>
-            <w:bookmarkStart w:id="49" w:name="_Toc225926397"/>
+            <w:bookmarkStart w:id="49" w:name="_Toc226112843"/>
             <w:r>
               <w:lastRenderedPageBreak/>
               <w:t>F</w:t>
@@ -23540,7 +23492,7 @@
             <w:pPr>
               <w:pStyle w:val="Heading2"/>
             </w:pPr>
-            <w:bookmarkStart w:id="50" w:name="_Toc225926398"/>
+            <w:bookmarkStart w:id="50" w:name="_Toc226112844"/>
             <w:r>
               <w:t>F</w:t>
             </w:r>
@@ -23812,7 +23764,7 @@
             <w:pPr>
               <w:pStyle w:val="Heading2"/>
             </w:pPr>
-            <w:bookmarkStart w:id="51" w:name="_Toc225926399"/>
+            <w:bookmarkStart w:id="51" w:name="_Toc226112845"/>
             <w:r>
               <w:t>F</w:t>
             </w:r>
@@ -24116,7 +24068,7 @@
                 <w:lang w:val="en-GB"/>
               </w:rPr>
             </w:pPr>
-            <w:bookmarkStart w:id="52" w:name="_Toc225926400"/>
+            <w:bookmarkStart w:id="52" w:name="_Toc226112846"/>
             <w:r>
               <w:rPr>
                 <w:b/>
@@ -24248,7 +24200,7 @@
             <w:pPr>
               <w:pStyle w:val="Heading2"/>
             </w:pPr>
-            <w:bookmarkStart w:id="53" w:name="_Toc225926401"/>
+            <w:bookmarkStart w:id="53" w:name="_Toc226112847"/>
             <w:r>
               <w:t>F</w:t>
             </w:r>
@@ -24536,7 +24488,7 @@
             <w:pPr>
               <w:pStyle w:val="Heading2"/>
             </w:pPr>
-            <w:bookmarkStart w:id="54" w:name="_Toc225926402"/>
+            <w:bookmarkStart w:id="54" w:name="_Toc226112848"/>
             <w:r>
               <w:t>F</w:t>
             </w:r>
@@ -24822,7 +24774,7 @@
             <w:pPr>
               <w:pStyle w:val="Heading2"/>
             </w:pPr>
-            <w:bookmarkStart w:id="55" w:name="_Toc225926403"/>
+            <w:bookmarkStart w:id="55" w:name="_Toc226112849"/>
             <w:r>
               <w:t>F</w:t>
             </w:r>
@@ -25112,7 +25064,7 @@
             <w:pPr>
               <w:pStyle w:val="Heading2"/>
             </w:pPr>
-            <w:bookmarkStart w:id="56" w:name="_Toc225926404"/>
+            <w:bookmarkStart w:id="56" w:name="_Toc226112850"/>
             <w:r>
               <w:t>F</w:t>
             </w:r>
@@ -25476,7 +25428,7 @@
             <w:pPr>
               <w:pStyle w:val="Heading2"/>
             </w:pPr>
-            <w:bookmarkStart w:id="57" w:name="_Toc225926405"/>
+            <w:bookmarkStart w:id="57" w:name="_Toc226112851"/>
             <w:r>
               <w:t>F</w:t>
             </w:r>
@@ -25817,7 +25769,7 @@
             <w:pPr>
               <w:pStyle w:val="Heading2"/>
             </w:pPr>
-            <w:bookmarkStart w:id="58" w:name="_Toc225926406"/>
+            <w:bookmarkStart w:id="58" w:name="_Toc226112852"/>
             <w:r>
               <w:t>F</w:t>
             </w:r>
@@ -26178,7 +26130,7 @@
             <w:pPr>
               <w:pStyle w:val="Heading2"/>
             </w:pPr>
-            <w:bookmarkStart w:id="59" w:name="_Toc225926407"/>
+            <w:bookmarkStart w:id="59" w:name="_Toc226112853"/>
             <w:r>
               <w:t>F</w:t>
             </w:r>
@@ -26542,7 +26494,7 @@
                 <w:lang w:val="en-GB"/>
               </w:rPr>
             </w:pPr>
-            <w:bookmarkStart w:id="60" w:name="_Toc225926408"/>
+            <w:bookmarkStart w:id="60" w:name="_Toc226112854"/>
             <w:r>
               <w:rPr>
                 <w:b/>
@@ -26680,7 +26632,7 @@
             <w:pPr>
               <w:pStyle w:val="Heading2"/>
             </w:pPr>
-            <w:bookmarkStart w:id="61" w:name="_Toc225926409"/>
+            <w:bookmarkStart w:id="61" w:name="_Toc226112855"/>
             <w:r>
               <w:t>F</w:t>
             </w:r>
@@ -26943,7 +26895,7 @@
             <w:pPr>
               <w:pStyle w:val="Heading2"/>
             </w:pPr>
-            <w:bookmarkStart w:id="62" w:name="_Toc225926410"/>
+            <w:bookmarkStart w:id="62" w:name="_Toc226112856"/>
             <w:r>
               <w:t>F</w:t>
             </w:r>
@@ -27252,7 +27204,7 @@
             <w:pPr>
               <w:pStyle w:val="Heading2"/>
             </w:pPr>
-            <w:bookmarkStart w:id="63" w:name="_Toc225926411"/>
+            <w:bookmarkStart w:id="63" w:name="_Toc226112857"/>
             <w:r>
               <w:lastRenderedPageBreak/>
               <w:t>F</w:t>
@@ -27654,7 +27606,7 @@
             <w:pPr>
               <w:pStyle w:val="Heading2"/>
             </w:pPr>
-            <w:bookmarkStart w:id="64" w:name="_Toc225926412"/>
+            <w:bookmarkStart w:id="64" w:name="_Toc226112858"/>
             <w:r>
               <w:lastRenderedPageBreak/>
               <w:t>F</w:t>
@@ -28190,7 +28142,7 @@
             <w:pPr>
               <w:pStyle w:val="Heading2"/>
             </w:pPr>
-            <w:bookmarkStart w:id="65" w:name="_Toc225926413"/>
+            <w:bookmarkStart w:id="65" w:name="_Toc226112859"/>
             <w:r>
               <w:t>F</w:t>
             </w:r>
@@ -28504,7 +28456,7 @@
                 <w:lang w:val="en-GB"/>
               </w:rPr>
             </w:pPr>
-            <w:bookmarkStart w:id="66" w:name="_Toc225926414"/>
+            <w:bookmarkStart w:id="66" w:name="_Toc226112860"/>
             <w:r>
               <w:rPr>
                 <w:b/>
@@ -28631,7 +28583,7 @@
             <w:pPr>
               <w:pStyle w:val="Heading2"/>
             </w:pPr>
-            <w:bookmarkStart w:id="67" w:name="_Toc225926415"/>
+            <w:bookmarkStart w:id="67" w:name="_Toc226112861"/>
             <w:r>
               <w:t>F</w:t>
             </w:r>
@@ -28952,7 +28904,7 @@
             <w:pPr>
               <w:pStyle w:val="Heading2"/>
             </w:pPr>
-            <w:bookmarkStart w:id="68" w:name="_Toc225926416"/>
+            <w:bookmarkStart w:id="68" w:name="_Toc226112862"/>
             <w:r>
               <w:t>F</w:t>
             </w:r>
@@ -29258,7 +29210,7 @@
             <w:pPr>
               <w:pStyle w:val="Heading2"/>
             </w:pPr>
-            <w:bookmarkStart w:id="69" w:name="_Toc225926417"/>
+            <w:bookmarkStart w:id="69" w:name="_Toc226112863"/>
             <w:r>
               <w:t>F</w:t>
             </w:r>
@@ -29713,7 +29665,7 @@
             <w:pPr>
               <w:pStyle w:val="Heading2"/>
             </w:pPr>
-            <w:bookmarkStart w:id="70" w:name="_Toc225926418"/>
+            <w:bookmarkStart w:id="70" w:name="_Toc226112864"/>
             <w:r>
               <w:lastRenderedPageBreak/>
               <w:t>F</w:t>
@@ -30481,7 +30433,7 @@
                 <w:lang w:val="en-GB"/>
               </w:rPr>
             </w:pPr>
-            <w:bookmarkStart w:id="71" w:name="_Toc225926419"/>
+            <w:bookmarkStart w:id="71" w:name="_Toc226112865"/>
             <w:r>
               <w:rPr>
                 <w:b/>
@@ -30611,7 +30563,7 @@
             <w:pPr>
               <w:pStyle w:val="Heading2"/>
             </w:pPr>
-            <w:bookmarkStart w:id="72" w:name="_Toc225926420"/>
+            <w:bookmarkStart w:id="72" w:name="_Toc226112866"/>
             <w:r>
               <w:t>F</w:t>
             </w:r>
@@ -30966,7 +30918,7 @@
             <w:pPr>
               <w:pStyle w:val="Heading2"/>
             </w:pPr>
-            <w:bookmarkStart w:id="73" w:name="_Toc225926421"/>
+            <w:bookmarkStart w:id="73" w:name="_Toc226112867"/>
             <w:r>
               <w:t>F</w:t>
             </w:r>
@@ -31326,7 +31278,7 @@
             <w:pPr>
               <w:pStyle w:val="Heading2"/>
             </w:pPr>
-            <w:bookmarkStart w:id="74" w:name="_Toc225926422"/>
+            <w:bookmarkStart w:id="74" w:name="_Toc226112868"/>
             <w:r>
               <w:t>F</w:t>
             </w:r>
@@ -31705,7 +31657,7 @@
             <w:pPr>
               <w:pStyle w:val="Heading2"/>
             </w:pPr>
-            <w:bookmarkStart w:id="75" w:name="_Toc225926423"/>
+            <w:bookmarkStart w:id="75" w:name="_Toc226112869"/>
             <w:r>
               <w:t>F</w:t>
             </w:r>
@@ -32121,7 +32073,7 @@
             <w:pPr>
               <w:pStyle w:val="Heading2"/>
             </w:pPr>
-            <w:bookmarkStart w:id="76" w:name="_Toc225926424"/>
+            <w:bookmarkStart w:id="76" w:name="_Toc226112870"/>
             <w:r>
               <w:t>F</w:t>
             </w:r>
@@ -32548,7 +32500,7 @@
                 <w:lang w:val="en-GB"/>
               </w:rPr>
             </w:pPr>
-            <w:bookmarkStart w:id="77" w:name="_Toc225926425"/>
+            <w:bookmarkStart w:id="77" w:name="_Toc226112871"/>
             <w:r>
               <w:rPr>
                 <w:b/>
@@ -32679,7 +32631,7 @@
             <w:pPr>
               <w:pStyle w:val="Heading2"/>
             </w:pPr>
-            <w:bookmarkStart w:id="78" w:name="_Toc225926426"/>
+            <w:bookmarkStart w:id="78" w:name="_Toc226112872"/>
             <w:r>
               <w:t>F</w:t>
             </w:r>
@@ -33117,7 +33069,7 @@
             <w:pPr>
               <w:pStyle w:val="Heading2"/>
             </w:pPr>
-            <w:bookmarkStart w:id="79" w:name="_Toc225926427"/>
+            <w:bookmarkStart w:id="79" w:name="_Toc226112873"/>
             <w:r>
               <w:t>F</w:t>
             </w:r>
@@ -33525,7 +33477,7 @@
             <w:pPr>
               <w:pStyle w:val="Heading2"/>
             </w:pPr>
-            <w:bookmarkStart w:id="80" w:name="_Toc225926428"/>
+            <w:bookmarkStart w:id="80" w:name="_Toc226112874"/>
             <w:r>
               <w:t>F</w:t>
             </w:r>
@@ -33887,7 +33839,7 @@
             <w:pPr>
               <w:pStyle w:val="Heading2"/>
             </w:pPr>
-            <w:bookmarkStart w:id="81" w:name="_Toc225926429"/>
+            <w:bookmarkStart w:id="81" w:name="_Toc226112875"/>
             <w:r>
               <w:t>F</w:t>
             </w:r>
@@ -34224,7 +34176,7 @@
             <w:pPr>
               <w:pStyle w:val="Heading2"/>
             </w:pPr>
-            <w:bookmarkStart w:id="82" w:name="_Toc225926430"/>
+            <w:bookmarkStart w:id="82" w:name="_Toc226112876"/>
             <w:r>
               <w:lastRenderedPageBreak/>
               <w:t>F</w:t>
@@ -34529,7 +34481,7 @@
             <w:pPr>
               <w:pStyle w:val="Heading2"/>
             </w:pPr>
-            <w:bookmarkStart w:id="83" w:name="_Toc225926431"/>
+            <w:bookmarkStart w:id="83" w:name="_Toc226112877"/>
             <w:r>
               <w:t>F</w:t>
             </w:r>
@@ -34871,7 +34823,7 @@
                 <w:lang w:val="en-GB"/>
               </w:rPr>
             </w:pPr>
-            <w:bookmarkStart w:id="84" w:name="_Toc225926432"/>
+            <w:bookmarkStart w:id="84" w:name="_Toc226112878"/>
             <w:r>
               <w:rPr>
                 <w:b/>
@@ -34999,7 +34951,7 @@
             <w:pPr>
               <w:pStyle w:val="Heading2"/>
             </w:pPr>
-            <w:bookmarkStart w:id="85" w:name="_Toc225926433"/>
+            <w:bookmarkStart w:id="85" w:name="_Toc226112879"/>
             <w:r>
               <w:lastRenderedPageBreak/>
               <w:t>F</w:t>
@@ -35458,7 +35410,7 @@
             <w:pPr>
               <w:pStyle w:val="Heading2"/>
             </w:pPr>
-            <w:bookmarkStart w:id="86" w:name="_Toc225926434"/>
+            <w:bookmarkStart w:id="86" w:name="_Toc226112880"/>
             <w:r>
               <w:t>F</w:t>
             </w:r>
@@ -36072,7 +36024,7 @@
             <w:pPr>
               <w:pStyle w:val="Heading2"/>
             </w:pPr>
-            <w:bookmarkStart w:id="87" w:name="_Toc225926435"/>
+            <w:bookmarkStart w:id="87" w:name="_Toc226112881"/>
             <w:r>
               <w:t>F</w:t>
             </w:r>
@@ -36515,7 +36467,7 @@
             <w:pPr>
               <w:pStyle w:val="Heading2"/>
             </w:pPr>
-            <w:bookmarkStart w:id="88" w:name="_Toc225926436"/>
+            <w:bookmarkStart w:id="88" w:name="_Toc226112882"/>
             <w:r>
               <w:t>F</w:t>
             </w:r>
@@ -36850,7 +36802,7 @@
             <w:pPr>
               <w:pStyle w:val="Heading2"/>
             </w:pPr>
-            <w:bookmarkStart w:id="89" w:name="_Toc225926437"/>
+            <w:bookmarkStart w:id="89" w:name="_Toc226112883"/>
             <w:r>
               <w:t>F</w:t>
             </w:r>
@@ -37246,6 +37198,94 @@
               </w:rPr>
               <w:t>Name of the variable to store the result (-1 if not found with $Error = 1)</w:t>
             </w:r>
+            <w:r>
+              <w:rPr>
+                <w:lang w:val="en-BE"/>
+              </w:rPr>
+              <w:t xml:space="preserve"> or a Boolean if a search value is used</w:t>
+            </w:r>
+          </w:p>
+        </w:tc>
+      </w:tr>
+      <w:tr>
+        <w:tc>
+          <w:tcPr>
+            <w:tcW w:w="1972" w:type="dxa"/>
+            <w:shd w:val="clear" w:color="auto" w:fill="D9E2F3" w:themeFill="accent1" w:themeFillTint="33"/>
+          </w:tcPr>
+          <w:p>
+            <w:pPr>
+              <w:rPr>
+                <w:b/>
+                <w:bCs/>
+              </w:rPr>
+            </w:pPr>
+            <w:r>
+              <w:rPr>
+                <w:b/>
+                <w:bCs/>
+              </w:rPr>
+              <w:t>Operation</w:t>
+            </w:r>
+          </w:p>
+        </w:tc>
+        <w:tc>
+          <w:tcPr>
+            <w:tcW w:w="7378" w:type="dxa"/>
+          </w:tcPr>
+          <w:p>
+            <w:pPr>
+              <w:rPr>
+                <w:lang w:val="en-BE"/>
+              </w:rPr>
+            </w:pPr>
+            <w:r>
+              <w:rPr>
+                <w:lang w:val="en-BE"/>
+              </w:rPr>
+              <w:t>Equal or Contains</w:t>
+            </w:r>
+          </w:p>
+        </w:tc>
+      </w:tr>
+      <w:tr>
+        <w:tc>
+          <w:tcPr>
+            <w:tcW w:w="1972" w:type="dxa"/>
+            <w:shd w:val="clear" w:color="auto" w:fill="D9E2F3" w:themeFill="accent1" w:themeFillTint="33"/>
+          </w:tcPr>
+          <w:p>
+            <w:pPr>
+              <w:rPr>
+                <w:b/>
+                <w:bCs/>
+              </w:rPr>
+            </w:pPr>
+            <w:r>
+              <w:rPr>
+                <w:b/>
+                <w:bCs/>
+              </w:rPr>
+              <w:t>Search value</w:t>
+            </w:r>
+          </w:p>
+        </w:tc>
+        <w:tc>
+          <w:tcPr>
+            <w:tcW w:w="7378" w:type="dxa"/>
+          </w:tcPr>
+          <w:p>
+            <w:pPr>
+              <w:rPr>
+                <w:lang w:val="en-BE"/>
+              </w:rPr>
+            </w:pPr>
+            <w:r>
+              <w:rPr>
+                <w:lang w:val="en-BE"/>
+              </w:rPr>
+              <w:t>(optional) &lt;N/A&gt; or a value to search in the result</w:t>
+            </w:r>
           </w:p>
         </w:tc>
       </w:tr>
@@ -37297,18 +37337,20 @@
         <w:tblLook w:val="04A0" w:firstRow="1" w:lastRow="0" w:firstColumn="1" w:lastColumn="0" w:noHBand="0" w:noVBand="1"/>
       </w:tblPr>
       <w:tblGrid>
-        <w:gridCol w:w="1283"/>
-        <w:gridCol w:w="1325"/>
-        <w:gridCol w:w="566"/>
-        <w:gridCol w:w="1404"/>
-        <w:gridCol w:w="1085"/>
-        <w:gridCol w:w="1126"/>
-        <w:gridCol w:w="2562"/>
+        <w:gridCol w:w="893"/>
+        <w:gridCol w:w="847"/>
+        <w:gridCol w:w="551"/>
+        <w:gridCol w:w="991"/>
+        <w:gridCol w:w="567"/>
+        <w:gridCol w:w="1132"/>
+        <w:gridCol w:w="991"/>
+        <w:gridCol w:w="1376"/>
+        <w:gridCol w:w="2003"/>
       </w:tblGrid>
       <w:tr>
         <w:tc>
           <w:tcPr>
-            <w:tcW w:w="1318" w:type="dxa"/>
+            <w:tcW w:w="893" w:type="dxa"/>
             <w:shd w:val="clear" w:color="auto" w:fill="D9E2F3" w:themeFill="accent1" w:themeFillTint="33"/>
           </w:tcPr>
           <w:p>
@@ -37329,7 +37371,7 @@
         </w:tc>
         <w:tc>
           <w:tcPr>
-            <w:tcW w:w="1371" w:type="dxa"/>
+            <w:tcW w:w="819" w:type="dxa"/>
             <w:shd w:val="clear" w:color="auto" w:fill="D9E2F3" w:themeFill="accent1" w:themeFillTint="33"/>
           </w:tcPr>
           <w:p>
@@ -37345,6 +37387,50 @@
                 <w:bCs/>
               </w:rPr>
               <w:t>Key</w:t>
+            </w:r>
+          </w:p>
+        </w:tc>
+        <w:tc>
+          <w:tcPr>
+            <w:tcW w:w="551" w:type="dxa"/>
+            <w:shd w:val="clear" w:color="auto" w:fill="D9E2F3" w:themeFill="accent1" w:themeFillTint="33"/>
+          </w:tcPr>
+          <w:p>
+            <w:pPr>
+              <w:rPr>
+                <w:b/>
+                <w:bCs/>
+              </w:rPr>
+            </w:pPr>
+            <w:r>
+              <w:rPr>
+                <w:b/>
+                <w:bCs/>
+              </w:rPr>
+              <w:t>Occ</w:t>
+            </w:r>
+          </w:p>
+        </w:tc>
+        <w:tc>
+          <w:tcPr>
+            <w:tcW w:w="993" w:type="dxa"/>
+            <w:shd w:val="clear" w:color="auto" w:fill="D9E2F3" w:themeFill="accent1" w:themeFillTint="33"/>
+          </w:tcPr>
+          <w:p>
+            <w:pPr>
+              <w:rPr>
+                <w:b/>
+                <w:bCs/>
+                <w:lang w:val="fr-BE"/>
+              </w:rPr>
+            </w:pPr>
+            <w:r>
+              <w:rPr>
+                <w:b/>
+                <w:bCs/>
+                <w:lang w:val="fr-BE"/>
+              </w:rPr>
+              <w:t>Parent</w:t>
             </w:r>
           </w:p>
         </w:tc>
@@ -37358,15 +37444,19 @@
               <w:rPr>
                 <w:b/>
                 <w:bCs/>
-              </w:rPr>
-            </w:pPr>
-            <w:r>
-              <w:rPr>
-                <w:b/>
-                <w:bCs/>
+                <w:lang w:val="fr-BE"/>
+              </w:rPr>
+            </w:pPr>
+            <w:proofErr w:type="spellStart"/>
+            <w:r>
+              <w:rPr>
+                <w:b/>
+                <w:bCs/>
+                <w:lang w:val="fr-BE"/>
               </w:rPr>
               <w:t>Occ</w:t>
             </w:r>
+            <w:proofErr w:type="spellEnd"/>
           </w:p>
         </w:tc>
         <w:tc>
@@ -37388,13 +37478,13 @@
                 <w:bCs/>
                 <w:lang w:val="fr-BE"/>
               </w:rPr>
-              <w:t>Parent</w:t>
-            </w:r>
-          </w:p>
-        </w:tc>
-        <w:tc>
-          <w:tcPr>
-            <w:tcW w:w="1134" w:type="dxa"/>
+              <w:t>Variable</w:t>
+            </w:r>
+          </w:p>
+        </w:tc>
+        <w:tc>
+          <w:tcPr>
+            <w:tcW w:w="992" w:type="dxa"/>
             <w:shd w:val="clear" w:color="auto" w:fill="D9E2F3" w:themeFill="accent1" w:themeFillTint="33"/>
           </w:tcPr>
           <w:p>
@@ -37405,6 +37495,29 @@
                 <w:lang w:val="fr-BE"/>
               </w:rPr>
             </w:pPr>
+            <w:r>
+              <w:rPr>
+                <w:b/>
+                <w:bCs/>
+                <w:lang w:val="fr-BE"/>
+              </w:rPr>
+              <w:t>Op</w:t>
+            </w:r>
+          </w:p>
+        </w:tc>
+        <w:tc>
+          <w:tcPr>
+            <w:tcW w:w="1378" w:type="dxa"/>
+            <w:shd w:val="clear" w:color="auto" w:fill="D9E2F3" w:themeFill="accent1" w:themeFillTint="33"/>
+          </w:tcPr>
+          <w:p>
+            <w:pPr>
+              <w:rPr>
+                <w:b/>
+                <w:bCs/>
+                <w:lang w:val="fr-BE"/>
+              </w:rPr>
+            </w:pPr>
             <w:proofErr w:type="spellStart"/>
             <w:r>
               <w:rPr>
@@ -37412,37 +37525,14 @@
                 <w:bCs/>
                 <w:lang w:val="fr-BE"/>
               </w:rPr>
-              <w:t>Occ</w:t>
+              <w:t>search</w:t>
             </w:r>
             <w:proofErr w:type="spellEnd"/>
           </w:p>
         </w:tc>
         <w:tc>
           <w:tcPr>
-            <w:tcW w:w="1134" w:type="dxa"/>
-            <w:shd w:val="clear" w:color="auto" w:fill="D9E2F3" w:themeFill="accent1" w:themeFillTint="33"/>
-          </w:tcPr>
-          <w:p>
-            <w:pPr>
-              <w:rPr>
-                <w:b/>
-                <w:bCs/>
-                <w:lang w:val="fr-BE"/>
-              </w:rPr>
-            </w:pPr>
-            <w:r>
-              <w:rPr>
-                <w:b/>
-                <w:bCs/>
-                <w:lang w:val="fr-BE"/>
-              </w:rPr>
-              <w:t>Variable</w:t>
-            </w:r>
-          </w:p>
-        </w:tc>
-        <w:tc>
-          <w:tcPr>
-            <w:tcW w:w="2693" w:type="dxa"/>
+            <w:tcW w:w="2024" w:type="dxa"/>
             <w:shd w:val="clear" w:color="auto" w:fill="D9E2F3" w:themeFill="accent1" w:themeFillTint="33"/>
           </w:tcPr>
           <w:p>
@@ -37467,7 +37557,7 @@
       <w:tr>
         <w:tc>
           <w:tcPr>
-            <w:tcW w:w="1318" w:type="dxa"/>
+            <w:tcW w:w="893" w:type="dxa"/>
           </w:tcPr>
           <w:p>
             <w:proofErr w:type="spellStart"/>
@@ -37479,7 +37569,7 @@
         </w:tc>
         <w:tc>
           <w:tcPr>
-            <w:tcW w:w="1371" w:type="dxa"/>
+            <w:tcW w:w="819" w:type="dxa"/>
           </w:tcPr>
           <w:p>
             <w:proofErr w:type="spellStart"/>
@@ -37491,10 +37581,46 @@
         </w:tc>
         <w:tc>
           <w:tcPr>
+            <w:tcW w:w="551" w:type="dxa"/>
+          </w:tcPr>
+          <w:p>
+            <w:r>
+              <w:t>1</w:t>
+            </w:r>
+          </w:p>
+        </w:tc>
+        <w:tc>
+          <w:tcPr>
+            <w:tcW w:w="993" w:type="dxa"/>
+          </w:tcPr>
+          <w:p>
+            <w:pPr>
+              <w:rPr>
+                <w:lang w:val="fr-BE"/>
+              </w:rPr>
+            </w:pPr>
+            <w:r>
+              <w:rPr>
+                <w:lang w:val="fr-BE"/>
+              </w:rPr>
+              <w:t>&lt;N/A&gt;</w:t>
+            </w:r>
+          </w:p>
+        </w:tc>
+        <w:tc>
+          <w:tcPr>
             <w:tcW w:w="567" w:type="dxa"/>
           </w:tcPr>
           <w:p>
-            <w:r>
+            <w:pPr>
+              <w:rPr>
+                <w:lang w:val="fr-BE"/>
+              </w:rPr>
+            </w:pPr>
+            <w:r>
+              <w:rPr>
+                <w:lang w:val="fr-BE"/>
+              </w:rPr>
               <w:t>1</w:t>
             </w:r>
           </w:p>
@@ -37513,31 +37639,33 @@
               <w:rPr>
                 <w:lang w:val="fr-BE"/>
               </w:rPr>
-              <w:t>&lt;N/A&gt;</w:t>
-            </w:r>
-          </w:p>
-        </w:tc>
-        <w:tc>
-          <w:tcPr>
-            <w:tcW w:w="1134" w:type="dxa"/>
-          </w:tcPr>
-          <w:p>
-            <w:pPr>
+              <w:t>$</w:t>
+            </w:r>
+            <w:proofErr w:type="spellStart"/>
+            <w:r>
               <w:rPr>
                 <w:lang w:val="fr-BE"/>
               </w:rPr>
-            </w:pPr>
-            <w:r>
+              <w:t>IDCard</w:t>
+            </w:r>
+            <w:proofErr w:type="spellEnd"/>
+          </w:p>
+        </w:tc>
+        <w:tc>
+          <w:tcPr>
+            <w:tcW w:w="992" w:type="dxa"/>
+          </w:tcPr>
+          <w:p>
+            <w:pPr>
               <w:rPr>
                 <w:lang w:val="fr-BE"/>
               </w:rPr>
-              <w:t>1</w:t>
-            </w:r>
-          </w:p>
-        </w:tc>
-        <w:tc>
-          <w:tcPr>
-            <w:tcW w:w="1134" w:type="dxa"/>
+            </w:pPr>
+          </w:p>
+        </w:tc>
+        <w:tc>
+          <w:tcPr>
+            <w:tcW w:w="1378" w:type="dxa"/>
           </w:tcPr>
           <w:p>
             <w:pPr>
@@ -37545,25 +37673,11 @@
                 <w:lang w:val="fr-BE"/>
               </w:rPr>
             </w:pPr>
-            <w:r>
-              <w:rPr>
-                <w:lang w:val="fr-BE"/>
-              </w:rPr>
-              <w:t>$</w:t>
-            </w:r>
-            <w:proofErr w:type="spellStart"/>
-            <w:r>
-              <w:rPr>
-                <w:lang w:val="fr-BE"/>
-              </w:rPr>
-              <w:t>IDCard</w:t>
-            </w:r>
-            <w:proofErr w:type="spellEnd"/>
-          </w:p>
-        </w:tc>
-        <w:tc>
-          <w:tcPr>
-            <w:tcW w:w="2693" w:type="dxa"/>
+          </w:p>
+        </w:tc>
+        <w:tc>
+          <w:tcPr>
+            <w:tcW w:w="2024" w:type="dxa"/>
           </w:tcPr>
           <w:p>
             <w:pPr>
@@ -37583,7 +37697,7 @@
       <w:tr>
         <w:tc>
           <w:tcPr>
-            <w:tcW w:w="1318" w:type="dxa"/>
+            <w:tcW w:w="893" w:type="dxa"/>
           </w:tcPr>
           <w:p>
             <w:proofErr w:type="spellStart"/>
@@ -37595,7 +37709,7 @@
         </w:tc>
         <w:tc>
           <w:tcPr>
-            <w:tcW w:w="1371" w:type="dxa"/>
+            <w:tcW w:w="819" w:type="dxa"/>
           </w:tcPr>
           <w:p>
             <w:proofErr w:type="spellStart"/>
@@ -37607,11 +37721,49 @@
         </w:tc>
         <w:tc>
           <w:tcPr>
+            <w:tcW w:w="551" w:type="dxa"/>
+          </w:tcPr>
+          <w:p>
+            <w:r>
+              <w:t>1</w:t>
+            </w:r>
+          </w:p>
+        </w:tc>
+        <w:tc>
+          <w:tcPr>
+            <w:tcW w:w="993" w:type="dxa"/>
+          </w:tcPr>
+          <w:p>
+            <w:pPr>
+              <w:rPr>
+                <w:lang w:val="fr-BE"/>
+              </w:rPr>
+            </w:pPr>
+            <w:proofErr w:type="spellStart"/>
+            <w:r>
+              <w:rPr>
+                <w:lang w:val="fr-BE"/>
+              </w:rPr>
+              <w:t>IDCards</w:t>
+            </w:r>
+            <w:proofErr w:type="spellEnd"/>
+          </w:p>
+        </w:tc>
+        <w:tc>
+          <w:tcPr>
             <w:tcW w:w="567" w:type="dxa"/>
           </w:tcPr>
           <w:p>
-            <w:r>
-              <w:t>1</w:t>
+            <w:pPr>
+              <w:rPr>
+                <w:lang w:val="fr-BE"/>
+              </w:rPr>
+            </w:pPr>
+            <w:r>
+              <w:rPr>
+                <w:lang w:val="fr-BE"/>
+              </w:rPr>
+              <w:t>2</w:t>
             </w:r>
           </w:p>
         </w:tc>
@@ -37625,19 +37777,17 @@
                 <w:lang w:val="fr-BE"/>
               </w:rPr>
             </w:pPr>
-            <w:proofErr w:type="spellStart"/>
             <w:r>
               <w:rPr>
                 <w:lang w:val="fr-BE"/>
               </w:rPr>
-              <w:t>IdentityCards</w:t>
-            </w:r>
-            <w:proofErr w:type="spellEnd"/>
-          </w:p>
-        </w:tc>
-        <w:tc>
-          <w:tcPr>
-            <w:tcW w:w="1134" w:type="dxa"/>
+              <w:t>$IDCard2</w:t>
+            </w:r>
+          </w:p>
+        </w:tc>
+        <w:tc>
+          <w:tcPr>
+            <w:tcW w:w="992" w:type="dxa"/>
           </w:tcPr>
           <w:p>
             <w:pPr>
@@ -37645,35 +37795,23 @@
                 <w:lang w:val="fr-BE"/>
               </w:rPr>
             </w:pPr>
-            <w:r>
+          </w:p>
+        </w:tc>
+        <w:tc>
+          <w:tcPr>
+            <w:tcW w:w="1378" w:type="dxa"/>
+          </w:tcPr>
+          <w:p>
+            <w:pPr>
               <w:rPr>
                 <w:lang w:val="fr-BE"/>
               </w:rPr>
-              <w:t>2</w:t>
-            </w:r>
-          </w:p>
-        </w:tc>
-        <w:tc>
-          <w:tcPr>
-            <w:tcW w:w="1134" w:type="dxa"/>
-          </w:tcPr>
-          <w:p>
-            <w:pPr>
-              <w:rPr>
-                <w:lang w:val="fr-BE"/>
-              </w:rPr>
-            </w:pPr>
-            <w:r>
-              <w:rPr>
-                <w:lang w:val="fr-BE"/>
-              </w:rPr>
-              <w:t>$IDCard2</w:t>
-            </w:r>
-          </w:p>
-        </w:tc>
-        <w:tc>
-          <w:tcPr>
-            <w:tcW w:w="2693" w:type="dxa"/>
+            </w:pPr>
+          </w:p>
+        </w:tc>
+        <w:tc>
+          <w:tcPr>
+            <w:tcW w:w="2024" w:type="dxa"/>
           </w:tcPr>
           <w:p>
             <w:pPr>
@@ -37693,7 +37831,7 @@
       <w:tr>
         <w:tc>
           <w:tcPr>
-            <w:tcW w:w="1318" w:type="dxa"/>
+            <w:tcW w:w="893" w:type="dxa"/>
           </w:tcPr>
           <w:p>
             <w:proofErr w:type="spellStart"/>
@@ -37705,7 +37843,7 @@
         </w:tc>
         <w:tc>
           <w:tcPr>
-            <w:tcW w:w="1371" w:type="dxa"/>
+            <w:tcW w:w="819" w:type="dxa"/>
           </w:tcPr>
           <w:p>
             <w:r>
@@ -37715,12 +37853,147 @@
         </w:tc>
         <w:tc>
           <w:tcPr>
+            <w:tcW w:w="551" w:type="dxa"/>
+          </w:tcPr>
+          <w:p/>
+        </w:tc>
+        <w:tc>
+          <w:tcPr>
+            <w:tcW w:w="993" w:type="dxa"/>
+          </w:tcPr>
+          <w:p>
+            <w:pPr>
+              <w:rPr>
+                <w:lang w:val="fr-BE"/>
+              </w:rPr>
+            </w:pPr>
+          </w:p>
+        </w:tc>
+        <w:tc>
+          <w:tcPr>
             <w:tcW w:w="567" w:type="dxa"/>
           </w:tcPr>
+          <w:p>
+            <w:pPr>
+              <w:rPr>
+                <w:lang w:val="fr-BE"/>
+              </w:rPr>
+            </w:pPr>
+          </w:p>
+        </w:tc>
+        <w:tc>
+          <w:tcPr>
+            <w:tcW w:w="1134" w:type="dxa"/>
+          </w:tcPr>
+          <w:p>
+            <w:pPr>
+              <w:rPr>
+                <w:lang w:val="fr-BE"/>
+              </w:rPr>
+            </w:pPr>
+          </w:p>
+        </w:tc>
+        <w:tc>
+          <w:tcPr>
+            <w:tcW w:w="992" w:type="dxa"/>
+          </w:tcPr>
           <w:p/>
         </w:tc>
         <w:tc>
           <w:tcPr>
+            <w:tcW w:w="1378" w:type="dxa"/>
+          </w:tcPr>
+          <w:p/>
+        </w:tc>
+        <w:tc>
+          <w:tcPr>
+            <w:tcW w:w="2024" w:type="dxa"/>
+          </w:tcPr>
+          <w:p>
+            <w:r>
+              <w:t>Dump of the result i</w:t>
+            </w:r>
+            <w:r>
+              <w:t>n the log</w:t>
+            </w:r>
+          </w:p>
+        </w:tc>
+      </w:tr>
+      <w:tr>
+        <w:tc>
+          <w:tcPr>
+            <w:tcW w:w="893" w:type="dxa"/>
+          </w:tcPr>
+          <w:p>
+            <w:proofErr w:type="spellStart"/>
+            <w:r>
+              <w:t>Httpget</w:t>
+            </w:r>
+            <w:proofErr w:type="spellEnd"/>
+          </w:p>
+        </w:tc>
+        <w:tc>
+          <w:tcPr>
+            <w:tcW w:w="819" w:type="dxa"/>
+          </w:tcPr>
+          <w:p>
+            <w:proofErr w:type="spellStart"/>
+            <w:r>
+              <w:t>CardNr</w:t>
+            </w:r>
+            <w:proofErr w:type="spellEnd"/>
+          </w:p>
+        </w:tc>
+        <w:tc>
+          <w:tcPr>
+            <w:tcW w:w="551" w:type="dxa"/>
+          </w:tcPr>
+          <w:p>
+            <w:r>
+              <w:t>1</w:t>
+            </w:r>
+          </w:p>
+        </w:tc>
+        <w:tc>
+          <w:tcPr>
+            <w:tcW w:w="993" w:type="dxa"/>
+          </w:tcPr>
+          <w:p>
+            <w:pPr>
+              <w:rPr>
+                <w:lang w:val="fr-BE"/>
+              </w:rPr>
+            </w:pPr>
+            <w:proofErr w:type="spellStart"/>
+            <w:r>
+              <w:rPr>
+                <w:lang w:val="fr-BE"/>
+              </w:rPr>
+              <w:t>IDCards</w:t>
+            </w:r>
+            <w:proofErr w:type="spellEnd"/>
+          </w:p>
+        </w:tc>
+        <w:tc>
+          <w:tcPr>
+            <w:tcW w:w="567" w:type="dxa"/>
+          </w:tcPr>
+          <w:p>
+            <w:pPr>
+              <w:rPr>
+                <w:lang w:val="fr-BE"/>
+              </w:rPr>
+            </w:pPr>
+            <w:r>
+              <w:rPr>
+                <w:lang w:val="fr-BE"/>
+              </w:rPr>
+              <w:t>1</w:t>
+            </w:r>
+          </w:p>
+        </w:tc>
+        <w:tc>
+          <w:tcPr>
             <w:tcW w:w="1134" w:type="dxa"/>
           </w:tcPr>
           <w:p>
@@ -37729,42 +38002,53 @@
                 <w:lang w:val="fr-BE"/>
               </w:rPr>
             </w:pPr>
-          </w:p>
-        </w:tc>
-        <w:tc>
-          <w:tcPr>
-            <w:tcW w:w="1134" w:type="dxa"/>
-          </w:tcPr>
-          <w:p>
-            <w:pPr>
+            <w:r>
               <w:rPr>
                 <w:lang w:val="fr-BE"/>
               </w:rPr>
-            </w:pPr>
-          </w:p>
-        </w:tc>
-        <w:tc>
-          <w:tcPr>
-            <w:tcW w:w="1134" w:type="dxa"/>
-          </w:tcPr>
-          <w:p>
-            <w:pPr>
+              <w:t>$</w:t>
+            </w:r>
+            <w:proofErr w:type="spellStart"/>
+            <w:r>
               <w:rPr>
                 <w:lang w:val="fr-BE"/>
               </w:rPr>
-            </w:pPr>
-          </w:p>
-        </w:tc>
-        <w:tc>
-          <w:tcPr>
-            <w:tcW w:w="2693" w:type="dxa"/>
-          </w:tcPr>
-          <w:p>
-            <w:r>
-              <w:t>Dump of the result i</w:t>
-            </w:r>
-            <w:r>
-              <w:t>n the log</w:t>
+              <w:t>Exist</w:t>
+            </w:r>
+            <w:proofErr w:type="spellEnd"/>
+          </w:p>
+        </w:tc>
+        <w:tc>
+          <w:tcPr>
+            <w:tcW w:w="992" w:type="dxa"/>
+          </w:tcPr>
+          <w:p>
+            <w:r>
+              <w:t>contains</w:t>
+            </w:r>
+          </w:p>
+        </w:tc>
+        <w:tc>
+          <w:tcPr>
+            <w:tcW w:w="1378" w:type="dxa"/>
+          </w:tcPr>
+          <w:p>
+            <w:r>
+              <w:rPr>
+                <w:sz w:val="18"/>
+                <w:szCs w:val="18"/>
+              </w:rPr>
+              <w:t>591286124036</w:t>
+            </w:r>
+          </w:p>
+        </w:tc>
+        <w:tc>
+          <w:tcPr>
+            <w:tcW w:w="2024" w:type="dxa"/>
+          </w:tcPr>
+          <w:p>
+            <w:r>
+              <w:t>True</w:t>
             </w:r>
           </w:p>
         </w:tc>
@@ -37864,167 +38148,442 @@
                 <w:sz w:val="18"/>
                 <w:szCs w:val="18"/>
               </w:rPr>
-              <w:t>IdentityCards</w:t>
-            </w:r>
-            <w:proofErr w:type="spellEnd"/>
+              <w:t>ID</w:t>
+            </w:r>
             <w:r>
               <w:rPr>
                 <w:sz w:val="18"/>
                 <w:szCs w:val="18"/>
               </w:rPr>
-              <w:t>&gt;</w:t>
-            </w:r>
-          </w:p>
-          <w:p>
-            <w:pPr>
-              <w:ind w:left="720"/>
+              <w:t>Cards</w:t>
+            </w:r>
+            <w:proofErr w:type="spellEnd"/>
+            <w:r>
               <w:rPr>
                 <w:sz w:val="18"/>
                 <w:szCs w:val="18"/>
               </w:rPr>
-            </w:pPr>
-            <w:r>
+              <w:t>&gt;</w:t>
+            </w:r>
+          </w:p>
+          <w:p>
+            <w:pPr>
+              <w:ind w:left="720"/>
               <w:rPr>
                 <w:sz w:val="18"/>
                 <w:szCs w:val="18"/>
               </w:rPr>
-              <w:t xml:space="preserve">      &lt;</w:t>
-            </w:r>
-            <w:proofErr w:type="spellStart"/>
+            </w:pPr>
             <w:r>
               <w:rPr>
                 <w:sz w:val="18"/>
                 <w:szCs w:val="18"/>
               </w:rPr>
-              <w:t>IdentityCard</w:t>
-            </w:r>
-            <w:proofErr w:type="spellEnd"/>
+              <w:t xml:space="preserve">      &lt;</w:t>
+            </w:r>
+            <w:proofErr w:type="spellStart"/>
             <w:r>
               <w:rPr>
                 <w:sz w:val="18"/>
                 <w:szCs w:val="18"/>
               </w:rPr>
-              <w:t xml:space="preserve"> Type="195"&gt;</w:t>
-            </w:r>
-          </w:p>
-          <w:p>
-            <w:pPr>
-              <w:ind w:left="720"/>
+              <w:t>I</w:t>
+            </w:r>
+            <w:r>
               <w:rPr>
                 <w:sz w:val="18"/>
                 <w:szCs w:val="18"/>
               </w:rPr>
-            </w:pPr>
+              <w:t>D</w:t>
+            </w:r>
             <w:r>
               <w:rPr>
                 <w:sz w:val="18"/>
                 <w:szCs w:val="18"/>
               </w:rPr>
-              <w:t xml:space="preserve">        &lt;</w:t>
-            </w:r>
-            <w:proofErr w:type="spellStart"/>
+              <w:t>Card</w:t>
+            </w:r>
+            <w:proofErr w:type="spellEnd"/>
             <w:r>
               <w:rPr>
                 <w:sz w:val="18"/>
                 <w:szCs w:val="18"/>
               </w:rPr>
-              <w:t>CardNumber</w:t>
-            </w:r>
-            <w:proofErr w:type="spellEnd"/>
-            <w:r>
+              <w:t xml:space="preserve"> Type="195"&gt;</w:t>
+            </w:r>
+          </w:p>
+          <w:p>
+            <w:pPr>
+              <w:ind w:left="720"/>
               <w:rPr>
                 <w:sz w:val="18"/>
                 <w:szCs w:val="18"/>
               </w:rPr>
-              <w:t>&gt;591286124036&lt;/</w:t>
-            </w:r>
-            <w:proofErr w:type="spellStart"/>
+            </w:pPr>
             <w:r>
               <w:rPr>
                 <w:sz w:val="18"/>
                 <w:szCs w:val="18"/>
               </w:rPr>
-              <w:t>CardNumber</w:t>
-            </w:r>
-            <w:proofErr w:type="spellEnd"/>
+              <w:t xml:space="preserve">        &lt;</w:t>
+            </w:r>
+            <w:proofErr w:type="spellStart"/>
             <w:r>
               <w:rPr>
                 <w:sz w:val="18"/>
                 <w:szCs w:val="18"/>
               </w:rPr>
-              <w:t>&gt;</w:t>
-            </w:r>
-          </w:p>
-          <w:p>
-            <w:pPr>
-              <w:ind w:left="720"/>
+              <w:t>CardN</w:t>
+            </w:r>
+            <w:r>
               <w:rPr>
                 <w:sz w:val="18"/>
                 <w:szCs w:val="18"/>
               </w:rPr>
-            </w:pPr>
+              <w:t>r</w:t>
+            </w:r>
+            <w:proofErr w:type="spellEnd"/>
             <w:r>
               <w:rPr>
                 <w:sz w:val="18"/>
                 <w:szCs w:val="18"/>
               </w:rPr>
-              <w:t xml:space="preserve">        &lt;ExpiryDate&gt;&lt;Century&gt;20&lt;/Century&gt;&lt;Year&gt;16&lt;/Year&gt;&lt;Month&gt;03&lt;/Month&gt;&lt;Day&gt;02&lt;/Day&gt;&lt;/ExpiryDate&gt;</w:t>
-            </w:r>
-          </w:p>
-          <w:p>
-            <w:pPr>
-              <w:ind w:left="720"/>
+              <w:t>&gt;591286124036&lt;/</w:t>
+            </w:r>
+            <w:proofErr w:type="spellStart"/>
+            <w:r>
               <w:rPr>
                 <w:sz w:val="18"/>
                 <w:szCs w:val="18"/>
               </w:rPr>
-            </w:pPr>
+              <w:t>CardN</w:t>
+            </w:r>
             <w:r>
               <w:rPr>
                 <w:sz w:val="18"/>
                 <w:szCs w:val="18"/>
               </w:rPr>
-              <w:t xml:space="preserve">      &lt;/</w:t>
-            </w:r>
-            <w:proofErr w:type="spellStart"/>
+              <w:t>r</w:t>
+            </w:r>
+            <w:proofErr w:type="spellEnd"/>
             <w:r>
               <w:rPr>
                 <w:sz w:val="18"/>
                 <w:szCs w:val="18"/>
               </w:rPr>
-              <w:t>IdentityCard</w:t>
-            </w:r>
-            <w:proofErr w:type="spellEnd"/>
-            <w:r>
+              <w:t>&gt;</w:t>
+            </w:r>
+          </w:p>
+          <w:p>
+            <w:pPr>
+              <w:ind w:left="720"/>
               <w:rPr>
                 <w:sz w:val="18"/>
                 <w:szCs w:val="18"/>
               </w:rPr>
-              <w:t>&gt;</w:t>
-            </w:r>
-          </w:p>
-          <w:p>
-            <w:pPr>
-              <w:ind w:left="720"/>
+            </w:pPr>
+            <w:r>
               <w:rPr>
                 <w:sz w:val="18"/>
                 <w:szCs w:val="18"/>
               </w:rPr>
-            </w:pPr>
-            <w:r>
+              <w:t xml:space="preserve">        &lt;ExpiryDate&gt;&lt;Century&gt;20&lt;/Century&gt;&lt;Year&gt;16&lt;/Year&gt;&lt;Month&gt;03&lt;/Month&gt;&lt;Day&gt;02&lt;/Day&gt;&lt;/ExpiryDate&gt;</w:t>
+            </w:r>
+          </w:p>
+          <w:p>
+            <w:pPr>
+              <w:ind w:left="720"/>
               <w:rPr>
                 <w:sz w:val="18"/>
                 <w:szCs w:val="18"/>
               </w:rPr>
-              <w:t xml:space="preserve"> &lt;/</w:t>
-            </w:r>
-            <w:proofErr w:type="spellStart"/>
+            </w:pPr>
             <w:r>
               <w:rPr>
                 <w:sz w:val="18"/>
                 <w:szCs w:val="18"/>
               </w:rPr>
-              <w:t>IdentityCards</w:t>
+              <w:t xml:space="preserve">      &lt;/</w:t>
+            </w:r>
+            <w:proofErr w:type="spellStart"/>
+            <w:r>
+              <w:rPr>
+                <w:sz w:val="18"/>
+                <w:szCs w:val="18"/>
+              </w:rPr>
+              <w:t>I</w:t>
+            </w:r>
+            <w:r>
+              <w:rPr>
+                <w:sz w:val="18"/>
+                <w:szCs w:val="18"/>
+              </w:rPr>
+              <w:t>D</w:t>
+            </w:r>
+            <w:r>
+              <w:rPr>
+                <w:sz w:val="18"/>
+                <w:szCs w:val="18"/>
+              </w:rPr>
+              <w:t>Card</w:t>
+            </w:r>
+            <w:proofErr w:type="spellEnd"/>
+            <w:r>
+              <w:rPr>
+                <w:sz w:val="18"/>
+                <w:szCs w:val="18"/>
+              </w:rPr>
+              <w:t>&gt;</w:t>
+            </w:r>
+          </w:p>
+          <w:p>
+            <w:pPr>
+              <w:ind w:left="720"/>
+              <w:rPr>
+                <w:sz w:val="18"/>
+                <w:szCs w:val="18"/>
+              </w:rPr>
+            </w:pPr>
+            <w:r>
+              <w:rPr>
+                <w:sz w:val="18"/>
+                <w:szCs w:val="18"/>
+              </w:rPr>
+              <w:t xml:space="preserve">      &lt;</w:t>
+            </w:r>
+            <w:proofErr w:type="spellStart"/>
+            <w:r>
+              <w:rPr>
+                <w:sz w:val="18"/>
+                <w:szCs w:val="18"/>
+              </w:rPr>
+              <w:t>I</w:t>
+            </w:r>
+            <w:r>
+              <w:rPr>
+                <w:sz w:val="18"/>
+                <w:szCs w:val="18"/>
+              </w:rPr>
+              <w:t>D</w:t>
+            </w:r>
+            <w:r>
+              <w:rPr>
+                <w:sz w:val="18"/>
+                <w:szCs w:val="18"/>
+              </w:rPr>
+              <w:t>Card</w:t>
+            </w:r>
+            <w:proofErr w:type="spellEnd"/>
+            <w:r>
+              <w:rPr>
+                <w:sz w:val="18"/>
+                <w:szCs w:val="18"/>
+              </w:rPr>
+              <w:t xml:space="preserve"> Type="19</w:t>
+            </w:r>
+            <w:r>
+              <w:rPr>
+                <w:sz w:val="18"/>
+                <w:szCs w:val="18"/>
+              </w:rPr>
+              <w:t>6</w:t>
+            </w:r>
+            <w:r>
+              <w:rPr>
+                <w:sz w:val="18"/>
+                <w:szCs w:val="18"/>
+              </w:rPr>
+              <w:t>"&gt;</w:t>
+            </w:r>
+          </w:p>
+          <w:p>
+            <w:pPr>
+              <w:ind w:left="720"/>
+              <w:rPr>
+                <w:sz w:val="18"/>
+                <w:szCs w:val="18"/>
+              </w:rPr>
+            </w:pPr>
+            <w:r>
+              <w:rPr>
+                <w:sz w:val="18"/>
+                <w:szCs w:val="18"/>
+              </w:rPr>
+              <w:t xml:space="preserve">        &lt;</w:t>
+            </w:r>
+            <w:proofErr w:type="spellStart"/>
+            <w:r>
+              <w:rPr>
+                <w:sz w:val="18"/>
+                <w:szCs w:val="18"/>
+              </w:rPr>
+              <w:t>CardN</w:t>
+            </w:r>
+            <w:r>
+              <w:rPr>
+                <w:sz w:val="18"/>
+                <w:szCs w:val="18"/>
+              </w:rPr>
+              <w:t>r</w:t>
+            </w:r>
+            <w:proofErr w:type="spellEnd"/>
+            <w:r>
+              <w:rPr>
+                <w:sz w:val="18"/>
+                <w:szCs w:val="18"/>
+              </w:rPr>
+              <w:t>&gt;</w:t>
+            </w:r>
+            <w:r>
+              <w:rPr>
+                <w:sz w:val="18"/>
+                <w:szCs w:val="18"/>
+              </w:rPr>
+              <w:t>123</w:t>
+            </w:r>
+            <w:r>
+              <w:rPr>
+                <w:sz w:val="18"/>
+                <w:szCs w:val="18"/>
+              </w:rPr>
+              <w:t>286124036&lt;/</w:t>
+            </w:r>
+            <w:proofErr w:type="spellStart"/>
+            <w:r>
+              <w:rPr>
+                <w:sz w:val="18"/>
+                <w:szCs w:val="18"/>
+              </w:rPr>
+              <w:t>CardN</w:t>
+            </w:r>
+            <w:r>
+              <w:rPr>
+                <w:sz w:val="18"/>
+                <w:szCs w:val="18"/>
+              </w:rPr>
+              <w:t>r</w:t>
+            </w:r>
+            <w:proofErr w:type="spellEnd"/>
+            <w:r>
+              <w:rPr>
+                <w:sz w:val="18"/>
+                <w:szCs w:val="18"/>
+              </w:rPr>
+              <w:t>&gt;</w:t>
+            </w:r>
+          </w:p>
+          <w:p>
+            <w:pPr>
+              <w:ind w:left="720"/>
+              <w:rPr>
+                <w:sz w:val="18"/>
+                <w:szCs w:val="18"/>
+              </w:rPr>
+            </w:pPr>
+            <w:r>
+              <w:rPr>
+                <w:sz w:val="18"/>
+                <w:szCs w:val="18"/>
+              </w:rPr>
+              <w:t xml:space="preserve">        &lt;ExpiryDate&gt;&lt;Century&gt;20&lt;/Century&gt;&lt;Year&gt;</w:t>
+            </w:r>
+            <w:r>
+              <w:rPr>
+                <w:sz w:val="18"/>
+                <w:szCs w:val="18"/>
+              </w:rPr>
+              <w:t>2</w:t>
+            </w:r>
+            <w:r>
+              <w:rPr>
+                <w:sz w:val="18"/>
+                <w:szCs w:val="18"/>
+              </w:rPr>
+              <w:t>6&lt;/Year&gt;&lt;Month&gt;03&lt;/Month&gt;&lt;Day&gt;02&lt;/Day&gt;&lt;/ExpiryDate&gt;</w:t>
+            </w:r>
+          </w:p>
+          <w:p>
+            <w:pPr>
+              <w:ind w:left="720"/>
+              <w:rPr>
+                <w:sz w:val="18"/>
+                <w:szCs w:val="18"/>
+              </w:rPr>
+            </w:pPr>
+            <w:r>
+              <w:rPr>
+                <w:sz w:val="18"/>
+                <w:szCs w:val="18"/>
+              </w:rPr>
+              <w:t xml:space="preserve">      &lt;/</w:t>
+            </w:r>
+            <w:proofErr w:type="spellStart"/>
+            <w:r>
+              <w:rPr>
+                <w:sz w:val="18"/>
+                <w:szCs w:val="18"/>
+              </w:rPr>
+              <w:t>I</w:t>
+            </w:r>
+            <w:r>
+              <w:rPr>
+                <w:sz w:val="18"/>
+                <w:szCs w:val="18"/>
+              </w:rPr>
+              <w:t>D</w:t>
+            </w:r>
+            <w:r>
+              <w:rPr>
+                <w:sz w:val="18"/>
+                <w:szCs w:val="18"/>
+              </w:rPr>
+              <w:t>Card</w:t>
+            </w:r>
+            <w:proofErr w:type="spellEnd"/>
+            <w:r>
+              <w:rPr>
+                <w:sz w:val="18"/>
+                <w:szCs w:val="18"/>
+              </w:rPr>
+              <w:t>&gt;</w:t>
+            </w:r>
+          </w:p>
+          <w:p>
+            <w:pPr>
+              <w:ind w:left="720"/>
+              <w:rPr>
+                <w:sz w:val="18"/>
+                <w:szCs w:val="18"/>
+              </w:rPr>
+            </w:pPr>
+            <w:r>
+              <w:rPr>
+                <w:sz w:val="18"/>
+                <w:szCs w:val="18"/>
+              </w:rPr>
+              <w:t xml:space="preserve"> &lt;/</w:t>
+            </w:r>
+            <w:proofErr w:type="spellStart"/>
+            <w:r>
+              <w:rPr>
+                <w:sz w:val="18"/>
+                <w:szCs w:val="18"/>
+              </w:rPr>
+              <w:t>I</w:t>
+            </w:r>
+            <w:r>
+              <w:rPr>
+                <w:sz w:val="18"/>
+                <w:szCs w:val="18"/>
+              </w:rPr>
+              <w:t>D</w:t>
+            </w:r>
+            <w:r>
+              <w:rPr>
+                <w:sz w:val="18"/>
+                <w:szCs w:val="18"/>
+              </w:rPr>
+              <w:t>Cards</w:t>
             </w:r>
             <w:proofErr w:type="spellEnd"/>
             <w:r>
@@ -38088,7 +38647,7 @@
             <w:pPr>
               <w:pStyle w:val="Heading2"/>
             </w:pPr>
-            <w:bookmarkStart w:id="90" w:name="_Toc225926438"/>
+            <w:bookmarkStart w:id="90" w:name="_Toc226112884"/>
             <w:r>
               <w:t>F</w:t>
             </w:r>
@@ -39354,7 +39913,7 @@
             <w:pPr>
               <w:pStyle w:val="Heading2"/>
             </w:pPr>
-            <w:bookmarkStart w:id="91" w:name="_Toc225926439"/>
+            <w:bookmarkStart w:id="91" w:name="_Toc226112885"/>
             <w:r>
               <w:t>F</w:t>
             </w:r>
@@ -40030,7 +40589,7 @@
             <w:pPr>
               <w:pStyle w:val="Heading2"/>
             </w:pPr>
-            <w:bookmarkStart w:id="92" w:name="_Toc225926440"/>
+            <w:bookmarkStart w:id="92" w:name="_Toc226112886"/>
             <w:r>
               <w:t>F</w:t>
             </w:r>
@@ -40939,7 +41498,7 @@
             <w:pPr>
               <w:pStyle w:val="Heading2"/>
             </w:pPr>
-            <w:bookmarkStart w:id="93" w:name="_Toc225926441"/>
+            <w:bookmarkStart w:id="93" w:name="_Toc226112887"/>
             <w:r>
               <w:t>F</w:t>
             </w:r>
@@ -42288,7 +42847,7 @@
             <w:r>
               <w:br w:type="page"/>
             </w:r>
-            <w:bookmarkStart w:id="94" w:name="_Toc225926442"/>
+            <w:bookmarkStart w:id="94" w:name="_Toc226112888"/>
             <w:r>
               <w:rPr>
                 <w:b/>
@@ -42425,7 +42984,7 @@
             <w:pPr>
               <w:pStyle w:val="Heading2"/>
             </w:pPr>
-            <w:bookmarkStart w:id="95" w:name="_Toc225926443"/>
+            <w:bookmarkStart w:id="95" w:name="_Toc226112889"/>
             <w:r>
               <w:t>F</w:t>
             </w:r>
@@ -42633,7 +43192,7 @@
             <w:pPr>
               <w:pStyle w:val="Heading2"/>
             </w:pPr>
-            <w:bookmarkStart w:id="96" w:name="_Toc225926444"/>
+            <w:bookmarkStart w:id="96" w:name="_Toc226112890"/>
             <w:r>
               <w:t>F</w:t>
             </w:r>
@@ -42845,7 +43404,7 @@
             <w:pPr>
               <w:pStyle w:val="Heading2"/>
             </w:pPr>
-            <w:bookmarkStart w:id="97" w:name="_Toc225926445"/>
+            <w:bookmarkStart w:id="97" w:name="_Toc226112891"/>
             <w:r>
               <w:t>F</w:t>
             </w:r>
@@ -43047,7 +43606,7 @@
             <w:pPr>
               <w:pStyle w:val="Heading2"/>
             </w:pPr>
-            <w:bookmarkStart w:id="98" w:name="_Toc225926446"/>
+            <w:bookmarkStart w:id="98" w:name="_Toc226112892"/>
             <w:r>
               <w:t>F</w:t>
             </w:r>
@@ -43381,7 +43940,7 @@
             <w:pPr>
               <w:pStyle w:val="Heading2"/>
             </w:pPr>
-            <w:bookmarkStart w:id="99" w:name="_Toc225926447"/>
+            <w:bookmarkStart w:id="99" w:name="_Toc226112893"/>
             <w:r>
               <w:lastRenderedPageBreak/>
               <w:t>F</w:t>
@@ -43688,7 +44247,7 @@
             <w:r>
               <w:br w:type="page"/>
             </w:r>
-            <w:bookmarkStart w:id="100" w:name="_Toc225926448"/>
+            <w:bookmarkStart w:id="100" w:name="_Toc226112894"/>
             <w:r>
               <w:rPr>
                 <w:b/>
@@ -43824,7 +44383,7 @@
             <w:pPr>
               <w:pStyle w:val="Heading2"/>
             </w:pPr>
-            <w:bookmarkStart w:id="101" w:name="_Toc225926449"/>
+            <w:bookmarkStart w:id="101" w:name="_Toc226112895"/>
             <w:r>
               <w:t>F</w:t>
             </w:r>
@@ -43958,7 +44517,7 @@
             <w:pPr>
               <w:pStyle w:val="Heading2"/>
             </w:pPr>
-            <w:bookmarkStart w:id="102" w:name="_Toc225926450"/>
+            <w:bookmarkStart w:id="102" w:name="_Toc226112896"/>
             <w:r>
               <w:t>F</w:t>
             </w:r>
@@ -44247,7 +44806,7 @@
             <w:pPr>
               <w:pStyle w:val="Heading2"/>
             </w:pPr>
-            <w:bookmarkStart w:id="103" w:name="_Toc225926451"/>
+            <w:bookmarkStart w:id="103" w:name="_Toc226112897"/>
             <w:r>
               <w:lastRenderedPageBreak/>
               <w:t>F</w:t>
@@ -44722,7 +45281,7 @@
             <w:pPr>
               <w:pStyle w:val="Heading2"/>
             </w:pPr>
-            <w:bookmarkStart w:id="104" w:name="_Toc225926452"/>
+            <w:bookmarkStart w:id="104" w:name="_Toc226112898"/>
             <w:r>
               <w:t>F</w:t>
             </w:r>
@@ -45231,7 +45790,7 @@
             <w:pPr>
               <w:pStyle w:val="Heading2"/>
             </w:pPr>
-            <w:bookmarkStart w:id="105" w:name="_Toc225926453"/>
+            <w:bookmarkStart w:id="105" w:name="_Toc226112899"/>
             <w:r>
               <w:lastRenderedPageBreak/>
               <w:t>F</w:t>
@@ -45483,7 +46042,7 @@
             <w:pPr>
               <w:pStyle w:val="Heading2"/>
             </w:pPr>
-            <w:bookmarkStart w:id="106" w:name="_Toc225926454"/>
+            <w:bookmarkStart w:id="106" w:name="_Toc226112900"/>
             <w:r>
               <w:t>F</w:t>
             </w:r>
@@ -45873,13 +46432,16 @@
             <w:t>1</w:t>
           </w:r>
           <w:r>
-            <w:t>6</w:t>
+            <w:t>7</w:t>
           </w:r>
           <w:r>
             <w:t xml:space="preserve"> –</w:t>
           </w:r>
           <w:r>
-            <w:t>01</w:t>
+            <w:t>0</w:t>
+          </w:r>
+          <w:r>
+            <w:t>3</w:t>
           </w:r>
           <w:r>
             <w:t>/</w:t>

</xml_diff>